<commit_message>
Informe V5: reducir fuente de bloques de codigo en anexos
</commit_message>
<xml_diff>
--- a/V4/devoluciones/build/tesis_v4.docx
+++ b/V4/devoluciones/build/tesis_v4.docx
@@ -105,11 +105,6 @@
           <w:lang w:val="es-AR"/>
         </w:rPr>
         <w:br/>
-      </w:r>
-      <w:r>
-        <w:rPr>
-          <w:lang w:val="es-AR"/>
-        </w:rPr>
         <w:t>Mendoza, Argentina — 2026</w:t>
       </w:r>
     </w:p>
@@ -357,16 +352,7 @@
           <w:bCs/>
           <w:lang w:val="es-AR"/>
         </w:rPr>
-        <w:t xml:space="preserve">apoyo en la </w:t>
-      </w:r>
-      <w:r>
-        <w:rPr>
-          <w:b/>
-          <w:bCs/>
-          <w:lang w:val="es-AR"/>
-        </w:rPr>
-        <w:lastRenderedPageBreak/>
-        <w:t>preparación y revisión del proceso de etiquetado</w:t>
+        <w:t>apoyo en la preparación y revisión del proceso de etiquetado</w:t>
       </w:r>
       <w:r>
         <w:rPr>
@@ -440,6 +426,7 @@
         <w:rPr>
           <w:lang w:val="es-AR"/>
         </w:rPr>
+        <w:lastRenderedPageBreak/>
         <w:t>Siglas</w:t>
       </w:r>
     </w:p>
@@ -1770,7 +1757,27 @@
           <w:iCs/>
           <w:lang w:val="es-AR"/>
         </w:rPr>
-        <w:t xml:space="preserve">Data </w:t>
+        <w:t>Data Definition Language</w:t>
+      </w:r>
+      <w:r>
+        <w:rPr>
+          <w:lang w:val="es-AR"/>
+        </w:rPr>
+        <w:t xml:space="preserve">, lenguaje de definición de datos. </w:t>
+      </w:r>
+      <w:r>
+        <w:rPr>
+          <w:b/>
+          <w:bCs/>
+          <w:lang w:val="es-AR"/>
+        </w:rPr>
+        <w:t>DSR</w:t>
+      </w:r>
+      <w:r>
+        <w:rPr>
+          <w:lang w:val="es-AR"/>
+        </w:rPr>
+        <w:t xml:space="preserve">: </w:t>
       </w:r>
       <w:r>
         <w:rPr>
@@ -1778,21 +1785,21 @@
           <w:iCs/>
           <w:lang w:val="es-AR"/>
         </w:rPr>
-        <w:t>Definition Language</w:t>
-      </w:r>
-      <w:r>
-        <w:rPr>
-          <w:lang w:val="es-AR"/>
-        </w:rPr>
-        <w:t xml:space="preserve">, lenguaje de definición de datos. </w:t>
-      </w:r>
-      <w:r>
-        <w:rPr>
-          <w:b/>
-          <w:bCs/>
-          <w:lang w:val="es-AR"/>
-        </w:rPr>
-        <w:t>DSR</w:t>
+        <w:t>Design Science Research</w:t>
+      </w:r>
+      <w:r>
+        <w:rPr>
+          <w:lang w:val="es-AR"/>
+        </w:rPr>
+        <w:t xml:space="preserve">, investigación en ciencia del diseño. </w:t>
+      </w:r>
+      <w:r>
+        <w:rPr>
+          <w:b/>
+          <w:bCs/>
+          <w:lang w:val="es-AR"/>
+        </w:rPr>
+        <w:t>ETL</w:t>
       </w:r>
       <w:r>
         <w:rPr>
@@ -1806,79 +1813,93 @@
           <w:iCs/>
           <w:lang w:val="es-AR"/>
         </w:rPr>
-        <w:t>Design Science Research</w:t>
-      </w:r>
-      <w:r>
-        <w:rPr>
-          <w:lang w:val="es-AR"/>
-        </w:rPr>
-        <w:t xml:space="preserve">, investigación en ciencia del diseño. </w:t>
-      </w:r>
-      <w:r>
-        <w:rPr>
-          <w:b/>
-          <w:bCs/>
-          <w:lang w:val="es-AR"/>
-        </w:rPr>
-        <w:t>ETL</w:t>
-      </w:r>
-      <w:r>
-        <w:rPr>
-          <w:lang w:val="es-AR"/>
-        </w:rPr>
+        <w:t>Extract, Transform, Load</w:t>
+      </w:r>
+      <w:r>
+        <w:rPr>
+          <w:lang w:val="es-AR"/>
+        </w:rPr>
+        <w:t xml:space="preserve">. </w:t>
+      </w:r>
+      <w:r>
+        <w:rPr>
+          <w:b/>
+          <w:bCs/>
+        </w:rPr>
+        <w:t>FN/FP</w:t>
+      </w:r>
+      <w:r>
+        <w:t xml:space="preserve">: falso negativo y falso positivo. </w:t>
+      </w:r>
+      <w:r>
+        <w:rPr>
+          <w:b/>
+          <w:bCs/>
+        </w:rPr>
+        <w:t>HMAC</w:t>
+      </w:r>
+      <w:r>
         <w:t xml:space="preserve">: </w:t>
       </w:r>
       <w:r>
         <w:rPr>
           <w:i/>
           <w:iCs/>
-          <w:lang w:val="es-AR"/>
-        </w:rPr>
-        <w:t>Extract, Transform, Load</w:t>
-      </w:r>
-      <w:r>
-        <w:rPr>
-          <w:lang w:val="es-AR"/>
-        </w:rPr>
+        </w:rPr>
+        <w:t>Hash-based Message Authentication Code</w:t>
+      </w:r>
+      <w:r>
         <w:t xml:space="preserve">. </w:t>
       </w:r>
       <w:r>
         <w:rPr>
           <w:b/>
           <w:bCs/>
-        </w:rPr>
-        <w:t>FN/FP</w:t>
-      </w:r>
-      <w:r>
-        <w:t xml:space="preserve">: falso negativo y falso positivo. </w:t>
-      </w:r>
-      <w:r>
-        <w:rPr>
-          <w:b/>
-          <w:bCs/>
-        </w:rPr>
-        <w:t>HMAC</w:t>
-      </w:r>
-      <w:r>
+          <w:lang w:val="es-AR"/>
+        </w:rPr>
+        <w:t>NLP</w:t>
+      </w:r>
+      <w:r>
+        <w:rPr>
+          <w:lang w:val="es-AR"/>
+        </w:rPr>
         <w:t xml:space="preserve">: </w:t>
       </w:r>
       <w:r>
         <w:rPr>
           <w:i/>
           <w:iCs/>
-        </w:rPr>
-        <w:t>Hash-based Message Authentication Code</w:t>
-      </w:r>
-      <w:r>
-        <w:t xml:space="preserve">. </w:t>
-      </w:r>
-      <w:r>
-        <w:rPr>
-          <w:b/>
-          <w:bCs/>
-          <w:lang w:val="es-AR"/>
-        </w:rPr>
-        <w:t>NLP</w:t>
+          <w:lang w:val="es-AR"/>
+        </w:rPr>
+        <w:t>Natural Language Processing</w:t>
+      </w:r>
+      <w:r>
+        <w:rPr>
+          <w:lang w:val="es-AR"/>
+        </w:rPr>
+        <w:t xml:space="preserve">, procesamiento de lenguaje natural. </w:t>
+      </w:r>
+      <w:r>
+        <w:rPr>
+          <w:b/>
+          <w:bCs/>
+          <w:lang w:val="es-AR"/>
+        </w:rPr>
+        <w:t>OE</w:t>
+      </w:r>
+      <w:r>
+        <w:rPr>
+          <w:lang w:val="es-AR"/>
+        </w:rPr>
+        <w:t xml:space="preserve">: objetivo específico. </w:t>
+      </w:r>
+      <w:r>
+        <w:rPr>
+          <w:b/>
+          <w:bCs/>
+          <w:lang w:val="es-AR"/>
+        </w:rPr>
+        <w:t>OSINT</w:t>
       </w:r>
       <w:r>
         <w:rPr>
@@ -1892,35 +1913,63 @@
           <w:iCs/>
           <w:lang w:val="es-AR"/>
         </w:rPr>
-        <w:t>Natural Language Processing</w:t>
-      </w:r>
-      <w:r>
-        <w:rPr>
-          <w:lang w:val="es-AR"/>
-        </w:rPr>
-        <w:t xml:space="preserve">, procesamiento de lenguaje natural. </w:t>
-      </w:r>
-      <w:r>
-        <w:rPr>
-          <w:b/>
-          <w:bCs/>
-          <w:lang w:val="es-AR"/>
-        </w:rPr>
-        <w:t>OE</w:t>
-      </w:r>
-      <w:r>
-        <w:rPr>
-          <w:lang w:val="es-AR"/>
-        </w:rPr>
-        <w:t xml:space="preserve">: objetivo específico. </w:t>
-      </w:r>
-      <w:r>
-        <w:rPr>
-          <w:b/>
-          <w:bCs/>
-          <w:lang w:val="es-AR"/>
-        </w:rPr>
-        <w:t>OSINT</w:t>
+        <w:t>Open Source Intelligence</w:t>
+      </w:r>
+      <w:r>
+        <w:rPr>
+          <w:lang w:val="es-AR"/>
+        </w:rPr>
+        <w:t xml:space="preserve">. </w:t>
+      </w:r>
+      <w:r>
+        <w:rPr>
+          <w:b/>
+          <w:bCs/>
+          <w:lang w:val="es-AR"/>
+        </w:rPr>
+        <w:t>PI</w:t>
+      </w:r>
+      <w:r>
+        <w:rPr>
+          <w:lang w:val="es-AR"/>
+        </w:rPr>
+        <w:t xml:space="preserve">: pregunta de investigación. </w:t>
+      </w:r>
+      <w:r>
+        <w:rPr>
+          <w:b/>
+          <w:bCs/>
+          <w:lang w:val="es-AR"/>
+        </w:rPr>
+        <w:t>P50/P95</w:t>
+      </w:r>
+      <w:r>
+        <w:rPr>
+          <w:lang w:val="es-AR"/>
+        </w:rPr>
+        <w:t xml:space="preserve">: percentil 50 y percentil 95. </w:t>
+      </w:r>
+      <w:r>
+        <w:rPr>
+          <w:b/>
+          <w:bCs/>
+          <w:lang w:val="es-AR"/>
+        </w:rPr>
+        <w:t>RSS/Atom</w:t>
+      </w:r>
+      <w:r>
+        <w:rPr>
+          <w:lang w:val="es-AR"/>
+        </w:rPr>
+        <w:t xml:space="preserve">: formatos de sindicación de contenidos web. </w:t>
+      </w:r>
+      <w:r>
+        <w:rPr>
+          <w:b/>
+          <w:bCs/>
+          <w:lang w:val="es-AR"/>
+        </w:rPr>
+        <w:t>SOCMINT</w:t>
       </w:r>
       <w:r>
         <w:rPr>
@@ -1934,85 +1983,7 @@
           <w:iCs/>
           <w:lang w:val="es-AR"/>
         </w:rPr>
-        <w:t>Open Source Intelligence</w:t>
-      </w:r>
-      <w:r>
-        <w:rPr>
-          <w:lang w:val="es-AR"/>
-        </w:rPr>
-        <w:t xml:space="preserve">. </w:t>
-      </w:r>
-      <w:r>
-        <w:rPr>
-          <w:b/>
-          <w:bCs/>
-          <w:lang w:val="es-AR"/>
-        </w:rPr>
-        <w:t>PI</w:t>
-      </w:r>
-      <w:r>
-        <w:rPr>
-          <w:lang w:val="es-AR"/>
-        </w:rPr>
-        <w:t xml:space="preserve">: pregunta de investigación. </w:t>
-      </w:r>
-      <w:r>
-        <w:rPr>
-          <w:b/>
-          <w:bCs/>
-          <w:lang w:val="es-AR"/>
-        </w:rPr>
-        <w:t>P50/P95</w:t>
-      </w:r>
-      <w:r>
-        <w:rPr>
-          <w:lang w:val="es-AR"/>
-        </w:rPr>
-        <w:t xml:space="preserve">: percentil 50 y percentil 95. </w:t>
-      </w:r>
-      <w:r>
-        <w:rPr>
-          <w:b/>
-          <w:bCs/>
-          <w:lang w:val="es-AR"/>
-        </w:rPr>
-        <w:t>RSS/Atom</w:t>
-      </w:r>
-      <w:r>
-        <w:rPr>
-          <w:lang w:val="es-AR"/>
-        </w:rPr>
-        <w:t xml:space="preserve">: formatos de sindicación de contenidos web. </w:t>
-      </w:r>
-      <w:r>
-        <w:rPr>
-          <w:b/>
-          <w:bCs/>
-          <w:lang w:val="es-AR"/>
-        </w:rPr>
-        <w:t>SOCMINT</w:t>
-      </w:r>
-      <w:r>
-        <w:rPr>
-          <w:lang w:val="es-AR"/>
-        </w:rPr>
-        <w:t xml:space="preserve">: </w:t>
-      </w:r>
-      <w:r>
-        <w:rPr>
-          <w:i/>
-          <w:iCs/>
-          <w:lang w:val="es-AR"/>
-        </w:rPr>
-        <w:t xml:space="preserve">Social Media </w:t>
-      </w:r>
-      <w:r>
-        <w:rPr>
-          <w:i/>
-          <w:iCs/>
-          <w:lang w:val="es-AR"/>
-        </w:rPr>
-        <w:t>Intelligence</w:t>
+        <w:t>Social Media Intelligence</w:t>
       </w:r>
       <w:r>
         <w:rPr>
@@ -2091,13 +2062,7 @@
         <w:rPr>
           <w:lang w:val="es-AR"/>
         </w:rPr>
-        <w:t>El presente Trabajo Final de Inserción detalla el diseño, desarrollo, implementación y evaluación de un sistema automatizado de monitoreo de comunidades digitales, concebido para recolectar, procesar, almacenar y analizar información pública relevante en el ámbito de la ciberseguridad en comunidades técnicas de Reddit, con atención al léxico rioplatense, enmarcado en el paradigma de la Inteligencia de Fuentes Abiertas (OSINT). El proyecto aborda la problemática de la dispersión, heterogeneidad y falta de es</w:t>
-      </w:r>
-      <w:r>
-        <w:rPr>
-          <w:lang w:val="es-AR"/>
-        </w:rPr>
-        <w:t>tructuración de los datos disponibles en internet, que dificultan la detección oportuna de amenazas y vulnerabilidades. La solución implementada integra herramientas de código abierto: n8n 2.40.6 para la orquestación de un pipeline ETL, PostgreSQL 18 para el almacenamiento relacional estructurado y un clasificador heurístico bilingüe, ejecutado dentro del propio orquestador, para la categorización de incidentes.</w:t>
+        <w:t>El presente Trabajo Final de Inserción detalla el diseño, desarrollo, implementación y evaluación de un sistema automatizado de monitoreo de comunidades digitales, concebido para recolectar, procesar, almacenar y analizar información pública relevante en el ámbito de la ciberseguridad en comunidades técnicas de Reddit, con atención al léxico rioplatense, enmarcado en el paradigma de la Inteligencia de Fuentes Abiertas (OSINT). El proyecto aborda la problemática de la dispersión, heterogeneidad y falta de estructuración de los datos disponibles en internet, que dificultan la detección oportuna de amenazas y vulnerabilidades. La solución implementada integra herramientas de código abierto: n8n 2.40.6 para la orquestación de un pipeline ETL, PostgreSQL 18 para el almacenamiento relacional estructurado y un clasificador heurístico bilingüe, ejecutado dentro del propio orquestador, para la categorización de incidentes.</w:t>
       </w:r>
     </w:p>
     <w:p>
@@ -2179,13 +2144,7 @@
         <w:rPr>
           <w:lang w:val="es-AR"/>
         </w:rPr>
-        <w:t xml:space="preserve"> y umbral mínimo de una coincidencia— determinó que el 76,52 % de las publicaciones no era relevante y asignó las 170 restantes a 8 categorías de amenaza, con predominio de Malware</w:t>
-      </w:r>
-      <w:r>
-        <w:rPr>
-          <w:lang w:val="es-AR"/>
-        </w:rPr>
-        <w:t xml:space="preserve"> (79) y Vulnerabilidades (61). El motor de detección evaluó 8 categorías en 15 fechas mediante un umbral de Poisson calibrado sobre una ventana móvil de 11 días, con un piso absoluto de 3 eventos, y registró 6 disparos. La muestra de control de 50 publicaciones etiquetadas manualmente por un único anotador arrojó una precisión, una sensibilidad y un F1-score de </w:t>
+        <w:t xml:space="preserve"> y umbral mínimo de una coincidencia— determinó que el 76,52 % de las publicaciones no era relevante y asignó las 170 restantes a 8 categorías de amenaza, con predominio de Malware (79) y Vulnerabilidades (61). El motor de detección evaluó 8 categorías en 15 fechas mediante un umbral de Poisson calibrado sobre una ventana móvil de 11 días, con un piso absoluto de 3 eventos, y registró 6 disparos. La muestra de control de 50 publicaciones etiquetadas manualmente por un único anotador arrojó una precisión, una sensibilidad y un F1-score de </w:t>
       </w:r>
       <w:r>
         <w:rPr>
@@ -2283,13 +2242,7 @@
         <w:rPr>
           <w:lang w:val="es-AR"/>
         </w:rPr>
-        <w:t xml:space="preserve">: </w:t>
-      </w:r>
-      <w:r>
-        <w:rPr>
-          <w:lang w:val="es-AR"/>
-        </w:rPr>
-        <w:t>recalculado sobre la fecha de creación de las publicaciones y con una línea base libre de la carga inicial, no emite ningún aviso en quince días. El informe documenta el marco legal de protección de datos personales bajo la Ley Nacional 25.326 y el Decreto 1558/2001, los principios de minimización y seudonimización aplicados y el riesgo residual que persiste sobre datos potencialmente reidentificables.</w:t>
+        <w:t>: recalculado sobre la fecha de creación de las publicaciones y con una línea base libre de la carga inicial, no emite ningún aviso en quince días. El informe documenta el marco legal de protección de datos personales bajo la Ley Nacional 25.326 y el Decreto 1558/2001, los principios de minimización y seudonimización aplicados y el riesgo residual que persiste sobre datos potencialmente reidentificables.</w:t>
       </w:r>
     </w:p>
     <w:p>
@@ -2343,10 +2296,7 @@
         <w:pStyle w:val="FirstParagraph"/>
       </w:pPr>
       <w:r>
-        <w:t>This Final Insertion Project presents the design, development, implementation and evaluation of an automated monitoring system for digital communities, built to harvest, process, store and analyze publicly available information relevant to cybersecurity in technical Reddit communities, with attention to Rioplatense Spanish, within the Open Source Intelligence (OSINT) paradigm. The project addresses the dispersion, heterogeneity and lack of structure of publicly available data, which hinder the timely detect</w:t>
-      </w:r>
-      <w:r>
-        <w:t>ion of threats and vulnerabilities. The implemented solution integrates open-source tools: n8n 2.40.6 for ETL pipeline orchestration, PostgreSQL 18 for structured relational storage, and a bilingual heuristic classifier running inside the orchestrator for incident categorization.</w:t>
+        <w:t>This Final Insertion Project presents the design, development, implementation and evaluation of an automated monitoring system for digital communities, built to harvest, process, store and analyze publicly available information relevant to cybersecurity in technical Reddit communities, with attention to Rioplatense Spanish, within the Open Source Intelligence (OSINT) paradigm. The project addresses the dispersion, heterogeneity and lack of structure of publicly available data, which hinder the timely detection of threats and vulnerabilities. The implemented solution integrates open-source tools: n8n 2.40.6 for ETL pipeline orchestration, PostgreSQL 18 for structured relational storage, and a bilingual heuristic classifier running inside the orchestrator for incident categorization.</w:t>
       </w:r>
     </w:p>
     <w:p>
@@ -2468,13 +2418,7 @@
         <w:t>not evaluated</w:t>
       </w:r>
       <w:r>
-        <w:t>, because the artifact’s capacity was not measured: the observed rate (about 45 posts per day) describes the source’s demand, not the system’s capacity. The alerting module is implemented but disabled by default, with no evidence of real delivery. The anomaly engine is likewise implemented, but its efficacy is not demonstrated: recalculated on post creation time with a baseline free of the initial load, it raises no alerts across fifteen days. The report documents the personal data protection legal framewor</w:t>
-      </w:r>
-      <w:r>
-        <w:t xml:space="preserve">k under Argentina’s National Law 25.326 and </w:t>
-      </w:r>
-      <w:r>
-        <w:t>Decree 1558/2001, the minimization and pseudonymization principles applied, and the residual risk that persists over potentially re-identifiable data.</w:t>
+        <w:t>, because the artifact’s capacity was not measured: the observed rate (about 45 posts per day) describes the source’s demand, not the system’s capacity. The alerting module is implemented but disabled by default, with no evidence of real delivery. The anomaly engine is likewise implemented, but its efficacy is not demonstrated: recalculated on post creation time with a baseline free of the initial load, it raises no alerts across fifteen days. The report documents the personal data protection legal framework under Argentina’s National Law 25.326 and Decree 1558/2001, the minimization and pseudonymization principles applied, and the residual risk that persists over potentially re-identifiable data.</w:t>
       </w:r>
     </w:p>
     <w:p>
@@ -2541,13 +2485,7 @@
         <w:rPr>
           <w:lang w:val="es-AR"/>
         </w:rPr>
-        <w:t xml:space="preserve">En la era digital contemporánea, las tecnologías de la información y la comunicación han reconfigurado las estructuras socioeconómicas, organizacionales y operativas a nivel global. La digitalización masiva de procesos críticos, transacciones comerciales y canales comunicacionales ha impulsado una proliferación sin precedentes de datos. Diariamente, millones de usuarios generan contenido en redes sociales, blogs, foros y plataformas especializadas, compartiendo experiencias, conocimiento técnico, opiniones </w:t>
-      </w:r>
-      <w:r>
-        <w:rPr>
-          <w:lang w:val="es-AR"/>
-        </w:rPr>
-        <w:t>e incidentes de diversa índole. Dentro del ámbito de la ciberseguridad, esta dinámica dio origen a un fenómeno de particular relevancia: las comunidades virtuales y los foros abiertos se convirtieron en repositorios primarios de información sobre amenazas emergentes, filtraciones de datos, vectores de ataque activos y vulnerabilidades recién divulgadas.</w:t>
+        <w:t>En la era digital contemporánea, las tecnologías de la información y la comunicación han reconfigurado las estructuras socioeconómicas, organizacionales y operativas a nivel global. La digitalización masiva de procesos críticos, transacciones comerciales y canales comunicacionales ha impulsado una proliferación sin precedentes de datos. Diariamente, millones de usuarios generan contenido en redes sociales, blogs, foros y plataformas especializadas, compartiendo experiencias, conocimiento técnico, opiniones e incidentes de diversa índole. Dentro del ámbito de la ciberseguridad, esta dinámica dio origen a un fenómeno de particular relevancia: las comunidades virtuales y los foros abiertos se convirtieron en repositorios primarios de información sobre amenazas emergentes, filtraciones de datos, vectores de ataque activos y vulnerabilidades recién divulgadas.</w:t>
       </w:r>
     </w:p>
     <w:p>
@@ -2561,13 +2499,7 @@
         <w:rPr>
           <w:lang w:val="es-AR"/>
         </w:rPr>
-        <w:t>Con frecuencia, los detalles de un ataque, las tácticas, técnicas y procedimientos (TTP) de un grupo delictivo o la explotación de una nueva vulnerabilidad se discuten e informan en foros abiertos antes de ser publicados en boletines oficiales de ciberseguridad o reportados por los proveedores de software. Esto se debe a que la velocidad con la que opera la comunidad de investigadores, entusiastas y actores maliciosos en internet supera holgadamente los ciclos de auditoría de los organismos tradicionales de</w:t>
-      </w:r>
-      <w:r>
-        <w:rPr>
-          <w:lang w:val="es-AR"/>
-        </w:rPr>
-        <w:t xml:space="preserve"> seguridad de la información (Glassman y Kang, 2012). En este contexto surge la necesidad de adoptar metodologías de Inteligencia de Amenazas (</w:t>
+        <w:t>Con frecuencia, los detalles de un ataque, las tácticas, técnicas y procedimientos (TTP) de un grupo delictivo o la explotación de una nueva vulnerabilidad se discuten e informan en foros abiertos antes de ser publicados en boletines oficiales de ciberseguridad o reportados por los proveedores de software. Esto se debe a que la velocidad con la que opera la comunidad de investigadores, entusiastas y actores maliciosos en internet supera holgadamente los ciclos de auditoría de los organismos tradicionales de seguridad de la información (Glassman y Kang, 2012). En este contexto surge la necesidad de adoptar metodologías de Inteligencia de Amenazas (</w:t>
       </w:r>
       <w:r>
         <w:rPr>
@@ -2626,13 +2558,7 @@
         <w:rPr>
           <w:lang w:val="es-AR"/>
         </w:rPr>
-        <w:t>A pesar del valor estratégico de la información disponible en plataformas abiertas, su explotación efectiva por parte de los equipos de ciberseguridad, los centros de operaciones de seguridad (SOC) y los analistas de la República Argentina se ve obstaculizada por factores técnicos y metodológicos. En primer lugar, el volumen y la tasa de generación de los datos: el monitoreo manual de múltiples foros, canales y redes sociales resulta inviable por las limitaciones del factor humano para procesar flujos conti</w:t>
-      </w:r>
-      <w:r>
-        <w:rPr>
-          <w:lang w:val="es-AR"/>
-        </w:rPr>
-        <w:t>nuos de información las 24 horas del día. En segundo lugar, la información se encuentra dispersa de manera heterogénea y fragmentada en decenas de comunidades digitales, cada una con sus propios formatos, terminologías y estructuras de datos (Pastor-Galindo et al., 2020).</w:t>
+        <w:t>A pesar del valor estratégico de la información disponible en plataformas abiertas, su explotación efectiva por parte de los equipos de ciberseguridad, los centros de operaciones de seguridad (SOC) y los analistas de la República Argentina se ve obstaculizada por factores técnicos y metodológicos. En primer lugar, el volumen y la tasa de generación de los datos: el monitoreo manual de múltiples foros, canales y redes sociales resulta inviable por las limitaciones del factor humano para procesar flujos continuos de información las 24 horas del día. En segundo lugar, la información se encuentra dispersa de manera heterogénea y fragmentada en decenas de comunidades digitales, cada una con sus propios formatos, terminologías y estructuras de datos (Pastor-Galindo et al., 2020).</w:t>
       </w:r>
     </w:p>
     <w:p>
@@ -2646,13 +2572,7 @@
         <w:rPr>
           <w:lang w:val="es-AR"/>
         </w:rPr>
-        <w:t xml:space="preserve">En tercer lugar, los datos carecen de estructuración formal: consisten predominantemente en texto libre en lenguaje natural, con modismos, jerga técnica y ruido semántico, lo que impide un análisis cuantitativo directo mediante sistemas de bases de datos tradicionales. En cuarto lugar, la disponibilidad de herramientas </w:t>
-      </w:r>
-      <w:r>
-        <w:rPr>
-          <w:lang w:val="es-AR"/>
-        </w:rPr>
-        <w:t>automatizadas, accesibles y adaptadas al contexto local es limitada, lo que dificulta la detección oportuna de tendencias específicas y la generación de avisos automáticos. Finalmente, la implementación de sistemas de recolección persistente debe conciliarse con los marcos éticos y legales vigentes, en especial la Ley Nacional 25.326 de Protección de Datos Personales.</w:t>
+        <w:t>En tercer lugar, los datos carecen de estructuración formal: consisten predominantemente en texto libre en lenguaje natural, con modismos, jerga técnica y ruido semántico, lo que impide un análisis cuantitativo directo mediante sistemas de bases de datos tradicionales. En cuarto lugar, la disponibilidad de herramientas automatizadas, accesibles y adaptadas al contexto local es limitada, lo que dificulta la detección oportuna de tendencias específicas y la generación de avisos automáticos. Finalmente, la implementación de sistemas de recolección persistente debe conciliarse con los marcos éticos y legales vigentes, en especial la Ley Nacional 25.326 de Protección de Datos Personales.</w:t>
       </w:r>
     </w:p>
     <w:p>
@@ -2680,13 +2600,7 @@
         <w:rPr>
           <w:lang w:val="es-AR"/>
         </w:rPr>
-        <w:t xml:space="preserve"> a las plataformas. La disponibilidad de interfaces de programación cambió de forma sustancial durante los últimos años: los accesos gratuitos a archivos históricos de terceros fueron discontinuados y las interfaces oficiales quedaron sujetas a autenticación, cuotas y políticas de uso que condicionan tanto el volumen como la profundidad temporal de la recolección posible. El diseño del sistema debió asumir esa restricción como una variable del problema y no como un detalle de implementación, tal como se doc</w:t>
-      </w:r>
-      <w:r>
-        <w:rPr>
-          <w:lang w:val="es-AR"/>
-        </w:rPr>
-        <w:t>umenta en el Capítulo 2 y en el Anexo B.</w:t>
+        <w:t xml:space="preserve"> a las plataformas. La disponibilidad de interfaces de programación cambió de forma sustancial durante los últimos años: los accesos gratuitos a archivos históricos de terceros fueron discontinuados y las interfaces oficiales quedaron sujetas a autenticación, cuotas y políticas de uso que condicionan tanto el volumen como la profundidad temporal de la recolección posible. El diseño del sistema debió asumir esa restricción como una variable del problema y no como un detalle de implementación, tal como se documenta en el Capítulo 2 y en el Anexo B.</w:t>
       </w:r>
     </w:p>
     <w:p>
@@ -2717,19 +2631,7 @@
         <w:rPr>
           <w:lang w:val="es-AR"/>
         </w:rPr>
-        <w:t>La viabilidad de implementar sistemas basados en OSINT en ciberseguridad se fundamenta en su bajo costo operativo, su alta accesibilidad y la riqueza de la información disponible públicamente. Automatizar la captura y el procesamiento de estos datos permite reducir el esfuerzo manual de los equipos de seguridad, de modo que los analistas concentren su capacidad en la toma de decisiones estratégicas de mitigación y en la respuesta ante incidentes (Russell y Klassen, 2019). La justificación de este proyecto r</w:t>
-      </w:r>
-      <w:r>
-        <w:rPr>
-          <w:lang w:val="es-AR"/>
-        </w:rPr>
-        <w:t>adica en proponer una solución tecnológica robusta, modular y de bajo costo para el contexto argentino. La integración de n8n como orquestador de flujos visuales tipo ETL permite una alta adaptabilidad para incorporar nuevas fuentes sin reescribir componentes de infraestructura, mientras que la persistencia en PostgreSQL garantiza un almacenamiento relacional íntegro y auditable, y el clasificador heurístico en español aporta la capacidad de estructurar y categorizar automáticamente el contenido en el idiom</w:t>
-      </w:r>
-      <w:r>
-        <w:rPr>
-          <w:lang w:val="es-AR"/>
-        </w:rPr>
-        <w:t>a local.</w:t>
+        <w:t>La viabilidad de implementar sistemas basados en OSINT en ciberseguridad se fundamenta en su bajo costo operativo, su alta accesibilidad y la riqueza de la información disponible públicamente. Automatizar la captura y el procesamiento de estos datos permite reducir el esfuerzo manual de los equipos de seguridad, de modo que los analistas concentren su capacidad en la toma de decisiones estratégicas de mitigación y en la respuesta ante incidentes (Russell y Klassen, 2019). La justificación de este proyecto radica en proponer una solución tecnológica robusta, modular y de bajo costo para el contexto argentino. La integración de n8n como orquestador de flujos visuales tipo ETL permite una alta adaptabilidad para incorporar nuevas fuentes sin reescribir componentes de infraestructura, mientras que la persistencia en PostgreSQL garantiza un almacenamiento relacional íntegro y auditable, y el clasificador heurístico en español aporta la capacidad de estructurar y categorizar automáticamente el contenido en el idioma local.</w:t>
       </w:r>
     </w:p>
     <w:p>
@@ -2743,13 +2645,7 @@
         <w:rPr>
           <w:lang w:val="es-AR"/>
         </w:rPr>
-        <w:t>La elección de un clasificador por diccionario —en lugar de un modelo estadístico o de un modelo de lenguaje— responde a tres razones explícitas: la interpretabilidad del resultado (cada categoría se puede explicar por los términos que la activaron), el costo computacional nulo en términos de infraestructura de entrenamiento y la adecuación al alcance de un trabajo final de tecnicatura. Esa decisión tiene un costo conocido, que este informe declara: el diccionario no lematiza, de modo que reconoce variantes</w:t>
-      </w:r>
-      <w:r>
-        <w:rPr>
-          <w:lang w:val="es-AR"/>
-        </w:rPr>
-        <w:t xml:space="preserve"> flexivas solo cuando están incluidas como términos, y su desempeño depende de la cobertura léxica del dominio.</w:t>
+        <w:t>La elección de un clasificador por diccionario —en lugar de un modelo estadístico o de un modelo de lenguaje— responde a tres razones explícitas: la interpretabilidad del resultado (cada categoría se puede explicar por los términos que la activaron), el costo computacional nulo en términos de infraestructura de entrenamiento y la adecuación al alcance de un trabajo final de tecnicatura. Esa decisión tiene un costo conocido, que este informe declara: el diccionario no lematiza, de modo que reconoce variantes flexivas solo cuando están incluidas como términos, y su desempeño depende de la cobertura léxica del dominio.</w:t>
       </w:r>
     </w:p>
     <w:p>
@@ -3167,13 +3063,7 @@
         <w:rPr>
           <w:lang w:val="es-AR"/>
         </w:rPr>
-        <w:t xml:space="preserve"> del modelo existe</w:t>
-      </w:r>
-      <w:r>
-        <w:rPr>
-          <w:lang w:val="es-AR"/>
-        </w:rPr>
-        <w:t xml:space="preserve"> pero no se pobló en la ventana evaluada), las fuentes que requieren credenciales o consentimiento (mensajería privada, foros cerrados, </w:t>
+        <w:t xml:space="preserve"> del modelo existe pero no se pobló en la ventana evaluada), las fuentes que requieren credenciales o consentimiento (mensajería privada, foros cerrados, </w:t>
       </w:r>
       <w:r>
         <w:rPr>
@@ -3569,13 +3459,7 @@
         <w:rPr>
           <w:lang w:val="es-AR"/>
         </w:rPr>
-        <w:t xml:space="preserve"> del trabajo, adoptando el valor usual del 80 % en métricas de clasificación como referencia práctica y ajustándolo a los objetivos operativos del usuario final del sistema. No se atribuyen a una fuente que fije esos umbrales: el relevamiento de Pastor-Galindo et al. (2020) describe oportunidades y desafíos del uso de OSINT, pero no prescribe umbrales de precisión ni de sensibilidad, de modo que se lo cita por el contexto del campo y no como origen del valor. No todos los criterios tienen el mismo origen te</w:t>
-      </w:r>
-      <w:r>
-        <w:rPr>
-          <w:lang w:val="es-AR"/>
-        </w:rPr>
-        <w:t>mporal, y la Tabla 1.1 lo declara criterio por criterio: confundir un umbral fijado en el diseño con uno incorporado después de conocer resultados convertiría la evaluación en una validación circular.</w:t>
+        <w:t xml:space="preserve"> del trabajo, adoptando el valor usual del 80 % en métricas de clasificación como referencia práctica y ajustándolo a los objetivos operativos del usuario final del sistema. No se atribuyen a una fuente que fije esos umbrales: el relevamiento de Pastor-Galindo et al. (2020) describe oportunidades y desafíos del uso de OSINT, pero no prescribe umbrales de precisión ni de sensibilidad, de modo que se lo cita por el contexto del campo y no como origen del valor. No todos los criterios tienen el mismo origen temporal, y la Tabla 1.1 lo declara criterio por criterio: confundir un umbral fijado en el diseño con uno incorporado después de conocer resultados convertiría la evaluación en una validación circular.</w:t>
       </w:r>
     </w:p>
     <w:p>
@@ -4125,13 +4009,7 @@
         <w:rPr>
           <w:lang w:val="es-AR"/>
         </w:rPr>
-        <w:t>. La razón es que su verificación requiere un diseño de captura–recaptura sobre fuentes independientes, y este trabajo dispone de una única fuente y de una única captura: cualquier cifra de cobertura calculada sobre el propio corpus sería un cociente sin denominador verificable. El tribunal de la V3 admitió explícitamente esta salida —retirar la métrica antes que presentarla como parcial sin justificación—. En consecuencia, la cobertura no aparece en el Resumen, en el Capítulo 5 ni en el Capítulo 7, y el an</w:t>
-      </w:r>
-      <w:r>
-        <w:rPr>
-          <w:lang w:val="es-AR"/>
-        </w:rPr>
-        <w:t xml:space="preserve">álisis de la </w:t>
+        <w:t xml:space="preserve">. La razón es que su verificación requiere un diseño de captura–recaptura sobre fuentes independientes, y este trabajo dispone de una única fuente y de una única captura: cualquier cifra de cobertura calculada sobre el propio corpus sería un cociente sin denominador verificable. El tribunal de la V3 admitió explícitamente esta salida —retirar la métrica antes que presentarla como parcial sin justificación—. En consecuencia, la cobertura no aparece en el Resumen, en el Capítulo 5 ni en el Capítulo 7, y el análisis de la </w:t>
       </w:r>
       <w:r>
         <w:rPr>
@@ -4257,13 +4135,7 @@
         <w:rPr>
           <w:lang w:val="es-AR"/>
         </w:rPr>
-        <w:t xml:space="preserve"> (19/10/2026), después del cierre de la ventana B5 y de conocerse la evaluación de la versión anterior, y se declara con esa fecha para no atribuirle un origen que no tiene. Su función es resumir en un solo valor el equilibrio entre precisión y sensibilidad, que hasta entonces se informaban por separado; su umbral de 0,80 se alinea con los de ambas, de modo que no introduce una exigencia adicional, sino una lectura conjunta. Al derivarse algebraicamente de precision</w:t>
-      </w:r>
-      <w:r>
-        <w:rPr>
-          <w:lang w:val="es-AR"/>
-        </w:rPr>
-        <w:t xml:space="preserve"> y sensibilidad, se informa siempre acompañado de los dos valores que lo componen.</w:t>
+        <w:t xml:space="preserve"> (19/10/2026), después del cierre de la ventana B5 y de conocerse la evaluación de la versión anterior, y se declara con esa fecha para no atribuirle un origen que no tiene. Su función es resumir en un solo valor el equilibrio entre precisión y sensibilidad, que hasta entonces se informaban por separado; su umbral de 0,80 se alinea con los de ambas, de modo que no introduce una exigencia adicional, sino una lectura conjunta. Al derivarse algebraicamente de precision y sensibilidad, se informa siempre acompañado de los dos valores que lo componen.</w:t>
       </w:r>
     </w:p>
     <w:p>
@@ -4312,13 +4184,7 @@
         <w:rPr>
           <w:lang w:val="es-AR"/>
         </w:rPr>
-        <w:t xml:space="preserve"> </w:t>
-      </w:r>
-      <w:r>
-        <w:rPr>
-          <w:lang w:val="es-AR"/>
-        </w:rPr>
-        <w:t xml:space="preserve">cuando no se cuentan los falsos negativos en el denominador—, de modo que no eran dos criterios sino uno expresado dos veces, y el valor 82 % no tenía derivación declarada. En esta versión se conserva un único umbral de precisión del 80 %, alineado con el valor que la tabla aplica también a sensibilidad y a F1, y la tasa de falsos descubrimientos se reporta como su complemento explícito. El cambio es previo a la observación de resultados y </w:t>
+        <w:t xml:space="preserve"> cuando no se cuentan los falsos negativos en el denominador—, de modo que no eran dos criterios sino uno expresado dos veces, y el valor 82 % no tenía derivación declarada. En esta versión se conserva un único umbral de precisión del 80 %, alineado con el valor que la tabla aplica también a sensibilidad y a F1, y la tasa de falsos descubrimientos se reporta como su complemento explícito. El cambio es previo a la observación de resultados y </w:t>
       </w:r>
       <w:r>
         <w:rPr>
@@ -4606,13 +4472,7 @@
         <w:rPr>
           <w:lang w:val="es-AR"/>
         </w:rPr>
-        <w:t xml:space="preserve">, OSINT) se refiere al proceso sistemático y estructurado de recopilar, procesar, analizar y explotar datos de acceso público en internet para convertirlos en inteligencia accionable destinada a la toma de decisiones estratégicas, operativas o tácticas (Russell y Klassen, 2019). El OSINT se rige por un ciclo de inteligencia clásico de cinco fases: planificación y dirección, recolección de datos, procesamiento y estructuración, análisis y producción de inteligencia, y difusión (Pastor-Galindo et al., 2020). </w:t>
-      </w:r>
-      <w:r>
-        <w:rPr>
-          <w:lang w:val="es-AR"/>
-        </w:rPr>
-        <w:t>Este trabajo se apoya en ese ciclo como esquema organizativo: la planificación y la dirección corresponden a la definición de objetivos y criterios del Capítulo 1; la recolección y el procesamiento, al pipeline descrito en el Capítulo 4; y el análisis, la producción y la difusión, al motor de anomalías y al módulo de alertas.</w:t>
+        <w:t>, OSINT) se refiere al proceso sistemático y estructurado de recopilar, procesar, analizar y explotar datos de acceso público en internet para convertirlos en inteligencia accionable destinada a la toma de decisiones estratégicas, operativas o tácticas (Russell y Klassen, 2019). El OSINT se rige por un ciclo de inteligencia clásico de cinco fases: planificación y dirección, recolección de datos, procesamiento y estructuración, análisis y producción de inteligencia, y difusión (Pastor-Galindo et al., 2020). Este trabajo se apoya en ese ciclo como esquema organizativo: la planificación y la dirección corresponden a la definición de objetivos y criterios del Capítulo 1; la recolección y el procesamiento, al pipeline descrito en el Capítulo 4; y el análisis, la producción y la difusión, al motor de anomalías y al módulo de alertas.</w:t>
       </w:r>
     </w:p>
     <w:p>
@@ -5274,15 +5134,7 @@
           <w:iCs/>
           <w:lang w:val="es-AR"/>
         </w:rPr>
-        <w:t xml:space="preserve">Extract, </w:t>
-      </w:r>
-      <w:r>
-        <w:rPr>
-          <w:i/>
-          <w:iCs/>
-          <w:lang w:val="es-AR"/>
-        </w:rPr>
-        <w:t>Transform, Load</w:t>
+        <w:t>Extract, Transform, Load</w:t>
       </w:r>
       <w:r>
         <w:rPr>
@@ -5484,13 +5336,7 @@
         <w:rPr>
           <w:lang w:val="es-AR"/>
         </w:rPr>
-        <w:t>En el plano académico, Liao et al. (2016) abordan la extracción automática de indicadores de compromiso desde fuentes abiertas de inteligencia de amenazas y muestran que la calidad de los indicadores depende críticamente de la normalización y del filtrado del texto; ese hallazgo es directamente aplicable a la decisión de este trabajo de priorizar la trazabilidad de cada categoría asignada. Zong et al. (2019) analizan la severidad percibida de las amenazas de ciberseguridad a partir del lenguaje con que se l</w:t>
-      </w:r>
-      <w:r>
-        <w:rPr>
-          <w:lang w:val="es-AR"/>
-        </w:rPr>
-        <w:t xml:space="preserve">as describe en redes sociales y muestran que ese lenguaje es ruidoso, heterogéneo y dependiente del contexto en que se publica; ese rasgo condiciona cualquier clasificación automática construida sobre texto social. El desafío se manifestó en este proyecto de forma desigual: </w:t>
+        <w:t xml:space="preserve">En el plano académico, Liao et al. (2016) abordan la extracción automática de indicadores de compromiso desde fuentes abiertas de inteligencia de amenazas y muestran que la calidad de los indicadores depende críticamente de la normalización y del filtrado del texto; ese hallazgo es directamente aplicable a la decisión de este trabajo de priorizar la trazabilidad de cada categoría asignada. Zong et al. (2019) analizan la severidad percibida de las amenazas de ciberseguridad a partir del lenguaje con que se las describe en redes sociales y muestran que ese lenguaje es ruidoso, heterogéneo y dependiente del contexto en que se publica; ese rasgo condiciona cualquier clasificación automática construida sobre texto social. El desafío se manifestó en este proyecto de forma desigual: </w:t>
       </w:r>
       <w:r>
         <w:rPr>
@@ -5554,13 +5400,7 @@
         <w:rPr>
           <w:lang w:val="es-AR"/>
         </w:rPr>
-        <w:t xml:space="preserve">, Trabajo Final de Carrera de la misma carrera y facultad, dirigido por el mismo director que este trabajo. Por tratarse de un trabajo inédito, sus cifras se citan según la versión consultada el 15/10/2026 y pueden variar en versiones posteriores (véase Referencias). El antecedente es de lectura obligada porque </w:t>
-      </w:r>
-      <w:r>
-        <w:rPr>
-          <w:lang w:val="es-AR"/>
-        </w:rPr>
-        <w:t>comparte objetivo general y difiere en decisiones estructurales. El contraste se resume en seis puntos:</w:t>
+        <w:t>, Trabajo Final de Carrera de la misma carrera y facultad, dirigido por el mismo director que este trabajo. Por tratarse de un trabajo inédito, sus cifras se citan según la versión consultada el 15/10/2026 y pueden variar en versiones posteriores (véase Referencias). El antecedente es de lectura obligada porque comparte objetivo general y difiere en decisiones estructurales. El contraste se resume en seis puntos:</w:t>
       </w:r>
     </w:p>
     <w:p>
@@ -5746,13 +5586,7 @@
         <w:rPr>
           <w:lang w:val="es-AR"/>
         </w:rPr>
-        <w:t xml:space="preserve"> de los casos por colisión con la raíz «cert</w:t>
-      </w:r>
-      <w:r>
-        <w:rPr>
-          <w:lang w:val="es-AR"/>
-        </w:rPr>
-        <w:t>-» en portugués y catalán) y opta por retirarla; ese episodio es evidencia externa y contemporánea de que la coincidencia léxica sin lematización produce falsos positivos, exactamente el fenómeno que este trabajo declara como limitación propia.</w:t>
+        <w:t xml:space="preserve"> de los casos por colisión con la raíz «cert-» en portugués y catalán) y opta por retirarla; ese episodio es evidencia externa y contemporánea de que la coincidencia léxica sin lematización produce falsos positivos, exactamente el fenómeno que este trabajo declara como limitación propia.</w:t>
       </w:r>
     </w:p>
     <w:p>
@@ -5884,13 +5718,7 @@
         <w:rPr>
           <w:lang w:val="es-AR"/>
         </w:rPr>
-        <w:t xml:space="preserve"> El antecedente invoca la Ley 25.326 y recomienda seudonimizar los identificadores antes de publicar los datos, además de advertir que la recolección multi-jurisdiccional</w:t>
-      </w:r>
-      <w:r>
-        <w:rPr>
-          <w:lang w:val="es-AR"/>
-        </w:rPr>
-        <w:t xml:space="preserve"> exige adoptar el criterio más estricto disponible. Este trabajo aplica seudonimización con clave en la etapa de ingesta, lo que respalda y anticipa esa recomendación.</w:t>
+        <w:t xml:space="preserve"> El antecedente invoca la Ley 25.326 y recomienda seudonimizar los identificadores antes de publicar los datos, además de advertir que la recolección multi-jurisdiccional exige adoptar el criterio más estricto disponible. Este trabajo aplica seudonimización con clave en la etapa de ingesta, lo que respalda y anticipa esa recomendación.</w:t>
       </w:r>
     </w:p>
     <w:p>
@@ -5940,13 +5768,7 @@
         <w:rPr>
           <w:lang w:val="es-AR"/>
         </w:rPr>
-        <w:t>. Una de las tres comunidades relevadas (r/devsarg</w:t>
-      </w:r>
-      <w:r>
-        <w:rPr>
-          <w:lang w:val="es-AR"/>
-        </w:rPr>
-        <w:t xml:space="preserve">) publica en español rioplatense; las otras dos (r/netsec y r/Malware), incorporadas por su densidad de reportes verificables, publican en inglés y </w:t>
+        <w:t xml:space="preserve">. Una de las tres comunidades relevadas (r/devsarg) publica en español rioplatense; las otras dos (r/netsec y r/Malware), incorporadas por su densidad de reportes verificables, publican en inglés y </w:t>
       </w:r>
       <w:r>
         <w:rPr>
@@ -5988,13 +5810,7 @@
         <w:rPr>
           <w:lang w:val="es-AR"/>
         </w:rPr>
-        <w:t>Lo que la brecha retiene como aporte es acotado y verificable. Las herramientas relevadas asumen el inglés como idioma estándar y no contemplan los modismos con los que los usuarios locales discuten estafas o incidentes: una caída de servicio se narra como «tiraron el sitio» o «se cayeron los servidores», una apropiación de cuenta como «me robaron la contraseña» o «me tomaron el control de la cuenta», y una extorsión como «me piden rescate» o «me bloquearon los archivos». Esos giros no aparecen en los vocab</w:t>
-      </w:r>
-      <w:r>
-        <w:rPr>
-          <w:lang w:val="es-AR"/>
-        </w:rPr>
-        <w:t>ularios técnicos en inglés, y un analista local necesita leerlos. El diccionario de este trabajo los incorpora de forma explícita (</w:t>
+        <w:t>Lo que la brecha retiene como aporte es acotado y verificable. Las herramientas relevadas asumen el inglés como idioma estándar y no contemplan los modismos con los que los usuarios locales discuten estafas o incidentes: una caída de servicio se narra como «tiraron el sitio» o «se cayeron los servidores», una apropiación de cuenta como «me robaron la contraseña» o «me tomaron el control de la cuenta», y una extorsión como «me piden rescate» o «me bloquearon los archivos». Esos giros no aparecen en los vocabularios técnicos en inglés, y un analista local necesita leerlos. El diccionario de este trabajo los incorpora de forma explícita (</w:t>
       </w:r>
       <w:r>
         <w:rPr>
@@ -6086,13 +5902,7 @@
         <w:rPr>
           <w:lang w:val="es-AR"/>
         </w:rPr>
-        <w:t xml:space="preserve"> documentados en 6.2, no se verifica como propiedad poblacional del sistema. Los trabajos académicos disponibles o bien se centran en indicadores técnicos (Liao et al., 2016), o bien analizan el lenguaje de las amenazas sobre plataformas globales en inglés, sin anclaje local (Zong et al., 2019). El antecedente de Dengra</w:t>
-      </w:r>
-      <w:r>
-        <w:rPr>
-          <w:lang w:val="es-AR"/>
-        </w:rPr>
-        <w:t xml:space="preserve"> y Rivas (2026) cubre el análisis del discurso en otra plataforma y con otro método. Este trabajo aporta, sobre esa base, un artefacto que además de recolectar y clasificar incorpora un motor de detección de anomalías con umbral estadístico explícito (Capítulo 4, sección 4.5) y un corpus fechado, auditable y con trazabilidad por consulta.</w:t>
+        <w:t xml:space="preserve"> documentados en 6.2, no se verifica como propiedad poblacional del sistema. Los trabajos académicos disponibles o bien se centran en indicadores técnicos (Liao et al., 2016), o bien analizan el lenguaje de las amenazas sobre plataformas globales en inglés, sin anclaje local (Zong et al., 2019). El antecedente de Dengra y Rivas (2026) cubre el análisis del discurso en otra plataforma y con otro método. Este trabajo aporta, sobre esa base, un artefacto que además de recolectar y clasificar incorpora un motor de detección de anomalías con umbral estadístico explícito (Capítulo 4, sección 4.5) y un corpus fechado, auditable y con trazabilidad por consulta.</w:t>
       </w:r>
     </w:p>
     <w:p>
@@ -9474,13 +9284,7 @@
         <w:rPr>
           <w:lang w:val="es-AR"/>
         </w:rPr>
-        <w:t>) calculado con una clave secreta. No se almacena el identificador original ni ninguna otra credencial. La terminología correcta es seudonimización —y no «anonimización irreversible», como se afirmó en una versión anterior de este informe—: el resultado es un dato que ya no es directamente vinculable a una persona, pero que sigue siendo un dato personal en los términos del artículo 2 de la ley. Tampoco se sostiene que el procedimiento sea «irreversible»: el HMAC-SHA-256 no es invertible sin la clave, pero e</w:t>
-      </w:r>
-      <w:r>
-        <w:rPr>
-          <w:lang w:val="es-AR"/>
-        </w:rPr>
-        <w:t>l espacio de nombres de usuario tiene baja entropía, de modo que un atacante que obtuviera la clave podría enumerar candidatos y probarlos contra la columna. Esa es la razón por la que la clave no se versiona, se rota y no existe ninguna tabla que vincule identificadores originales con sus valores HMAC.</w:t>
+        <w:t>) calculado con una clave secreta. No se almacena el identificador original ni ninguna otra credencial. La terminología correcta es seudonimización —y no «anonimización irreversible», como se afirmó en una versión anterior de este informe—: el resultado es un dato que ya no es directamente vinculable a una persona, pero que sigue siendo un dato personal en los términos del artículo 2 de la ley. Tampoco se sostiene que el procedimiento sea «irreversible»: el HMAC-SHA-256 no es invertible sin la clave, pero el espacio de nombres de usuario tiene baja entropía, de modo que un atacante que obtuviera la clave podría enumerar candidatos y probarlos contra la columna. Esa es la razón por la que la clave no se versiona, se rota y no existe ninguna tabla que vincule identificadores originales con sus valores HMAC.</w:t>
       </w:r>
     </w:p>
     <w:p>
@@ -9838,13 +9642,7 @@
         <w:rPr>
           <w:lang w:val="es-AR"/>
         </w:rPr>
-        <w:t>, que permiten abrir el hilo original aunque el autor esté seudonimizado</w:t>
-      </w:r>
-      <w:r>
-        <w:rPr>
-          <w:lang w:val="es-AR"/>
-        </w:rPr>
-        <w:t xml:space="preserve">; por eso el informe reemplaza los identificadores por códigos en el cuerpo y mantiene la correspondencia en un archivo separado. Segundo, la </w:t>
+        <w:t xml:space="preserve">, que permiten abrir el hilo original aunque el autor esté seudonimizado; por eso el informe reemplaza los identificadores por códigos en el cuerpo y mantiene la correspondencia en un archivo separado. Segundo, la </w:t>
       </w:r>
       <w:r>
         <w:rPr>
@@ -11057,13 +10855,7 @@
               <w:rPr>
                 <w:lang w:val="es-AR"/>
               </w:rPr>
-              <w:t>Seudonimiza</w:t>
-            </w:r>
-            <w:r>
-              <w:rPr>
-                <w:lang w:val="es-AR"/>
-              </w:rPr>
-              <w:t xml:space="preserve"> el identificador del autor con HMAC-SHA-256</w:t>
+              <w:t>Seudonimiza el identificador del autor con HMAC-SHA-256</w:t>
             </w:r>
           </w:p>
         </w:tc>
@@ -11661,13 +11453,7 @@
         <w:rPr>
           <w:lang w:val="es-AR"/>
         </w:rPr>
-        <w:t xml:space="preserve"> que garantiza que cada comunidad produzca al menos un elemento procesable por ciclo. Sin él, una fuente que devolviera cero elementos —escenario típico ante una respuesta 429— no propagaba ningún elemento a los nodos posteriores y el lazo de control </w:t>
-      </w:r>
-      <w:r>
-        <w:rPr>
-          <w:lang w:val="es-AR"/>
-        </w:rPr>
-        <w:t xml:space="preserve">avanzaba sin procesar el resto de la lista, con la consecuencia de que la comunidad ubicada en el tercer turno perdía sistemáticamente sus publicaciones. Este comportamiento se diagnosticó y se corrigió en el artefacto desplegado; el detalle del incidente y de su caracterización consta en </w:t>
+        <w:t xml:space="preserve"> que garantiza que cada comunidad produzca al menos un elemento procesable por ciclo. Sin él, una fuente que devolviera cero elementos —escenario típico ante una respuesta 429— no propagaba ningún elemento a los nodos posteriores y el lazo de control avanzaba sin procesar el resto de la lista, con la consecuencia de que la comunidad ubicada en el tercer turno perdía sistemáticamente sus publicaciones. Este comportamiento se diagnosticó y se corrigió en el artefacto desplegado; el detalle del incidente y de su caracterización consta en </w:t>
       </w:r>
       <w:r>
         <w:rPr>
@@ -14666,13 +14452,7 @@
         <w:rPr>
           <w:lang w:val="es-AR"/>
         </w:rPr>
-        <w:t xml:space="preserve"> El lazo de iteración se cierra desde el nodo de extracción de entidades, y no desde el de clasificación. La diferencia no es cosmética: la extracción tiene dos salidas y una de ellas transporta el elemento centinela cuando la comunidad no devolvió publicaciones, de modo que el lazo siempre recibe al menos un elemento y avanza. Si el cierre se hubiera dejado en el nodo de clasificación, una comunidad sin novedades o con respuesta bloqueada habría detenido el ciclo completo y las comunidades siguientes no se</w:t>
-      </w:r>
-      <w:r>
-        <w:rPr>
-          <w:lang w:val="es-AR"/>
-        </w:rPr>
-        <w:t xml:space="preserve"> habrían consultado, que es exactamente el fallo diagnosticado y corregido.</w:t>
+        <w:t xml:space="preserve"> El lazo de iteración se cierra desde el nodo de extracción de entidades, y no desde el de clasificación. La diferencia no es cosmética: la extracción tiene dos salidas y una de ellas transporta el elemento centinela cuando la comunidad no devolvió publicaciones, de modo que el lazo siempre recibe al menos un elemento y avanza. Si el cierre se hubiera dejado en el nodo de clasificación, una comunidad sin novedades o con respuesta bloqueada habría detenido el ciclo completo y las comunidades siguientes no se habrían consultado, que es exactamente el fallo diagnosticado y corregido.</w:t>
       </w:r>
     </w:p>
     <w:p>
@@ -14851,13 +14631,7 @@
         <w:rPr>
           <w:lang w:val="es-AR"/>
         </w:rPr>
-        <w:t>: los valores de latencia y throughput</w:t>
-      </w:r>
-      <w:r>
-        <w:rPr>
-          <w:lang w:val="es-AR"/>
-        </w:rPr>
-        <w:t xml:space="preserve"> de la sección 5.3 describen el comportamiento de una instalación de un solo nodo sobre recursos compartidos y no deben leerse como una medición de capacidad máxima. Los parámetros de CPU, memoria y entrada/salida del equipo anfitrión no se caracterizaron, y ese vacío se declara como limitación en 6.3 en lugar de reemplazarse por una estimación.</w:t>
+        <w:t>: los valores de latencia y throughput de la sección 5.3 describen el comportamiento de una instalación de un solo nodo sobre recursos compartidos y no deben leerse como una medición de capacidad máxima. Los parámetros de CPU, memoria y entrada/salida del equipo anfitrión no se caracterizaron, y ese vacío se declara como limitación en 6.3 en lugar de reemplazarse por una estimación.</w:t>
       </w:r>
     </w:p>
     <w:p>
@@ -15385,13 +15159,7 @@
         <w:rPr>
           <w:lang w:val="es-AR"/>
         </w:rPr>
-        <w:t xml:space="preserve"> El texto se lleva a minúsculas y se le remueven los diacríticos por descomposición Unicode, y luego se particiona por todo carácter que no sea alfanumérico. Ambas operaciones tienen consecuencias que conviene hacer explícitas. La primera obliga a escribir los términos del diccionario sin acentos: si un término se almacenara con diacríticos, el texto normalizado nunca lo contendría y la coincidencia sería imposible, de modo que el Anexo C reproduce el diccionario tal como está implementado y no en su forma </w:t>
-      </w:r>
-      <w:r>
-        <w:rPr>
-          <w:lang w:val="es-AR"/>
-        </w:rPr>
-        <w:t xml:space="preserve">ortográfica. Sobre ese texto normalizado se hacen dos búsquedas distintas. Los términos de </w:t>
+        <w:t xml:space="preserve"> El texto se lleva a minúsculas y se le remueven los diacríticos por descomposición Unicode, y luego se particiona por todo carácter que no sea alfanumérico. Ambas operaciones tienen consecuencias que conviene hacer explícitas. La primera obliga a escribir los términos del diccionario sin acentos: si un término se almacenara con diacríticos, el texto normalizado nunca lo contendría y la coincidencia sería imposible, de modo que el Anexo C reproduce el diccionario tal como está implementado y no en su forma ortográfica. Sobre ese texto normalizado se hacen dos búsquedas distintas. Los términos de </w:t>
       </w:r>
       <w:r>
         <w:rPr>
@@ -15547,13 +15315,7 @@
         <w:rPr>
           <w:lang w:val="es-AR"/>
         </w:rPr>
-        <w:t xml:space="preserve"> La primera versión del clasificador puntuaba dividiendo las coincidencias por la cantidad de términos de la categoría. Esa elección tenía un defecto estructural: como el denominador dependía del tamaño del diccionario, el </w:t>
-      </w:r>
-      <w:r>
-        <w:rPr>
-          <w:lang w:val="es-AR"/>
-        </w:rPr>
-        <w:t>mismo par de coincidencias pasaba de 0,22 a 0,07 a medida que el diccionario crecía, con lo cual la puntuación no era comparable entre corridas ni entre categorías. La escala vigente elimina el denominador variable y satura en cuatro coincidencias, de modo que dos coincidencias valen 0,5 y tres valen 0,75 con independencia de la categoría y de la versión del diccionario. Esta es la razón por la que la puntuación es interpretable como una medida de intensidad temática y no como una probabilidad.</w:t>
+        <w:t xml:space="preserve"> La primera versión del clasificador puntuaba dividiendo las coincidencias por la cantidad de términos de la categoría. Esa elección tenía un defecto estructural: como el denominador dependía del tamaño del diccionario, el mismo par de coincidencias pasaba de 0,22 a 0,07 a medida que el diccionario crecía, con lo cual la puntuación no era comparable entre corridas ni entre categorías. La escala vigente elimina el denominador variable y satura en cuatro coincidencias, de modo que dos coincidencias valen 0,5 y tres valen 0,75 con independencia de la categoría y de la versión del diccionario. Esta es la razón por la que la puntuación es interpretable como una medida de intensidad temática y no como una probabilidad.</w:t>
       </w:r>
     </w:p>
     <w:p>
@@ -15575,13 +15337,7 @@
         <w:rPr>
           <w:lang w:val="es-AR"/>
         </w:rPr>
-        <w:t xml:space="preserve"> Con dos coincidencias exigidas, el clasificador descartaba amenazas evidentes: una campaña de correos fraudulentos que se hacían pasar por una investigación de Interpol contenía un término del diccionario que coincidía sin ambigüedad, y aun así la publicación quedaba clasificada como no relevante porque solo acumulaba una coincidencia. La medición sobre la muestra de control fijó el costo de ambas alternativas: con el umbral en dos se detectaban 25 de 29 amenazas y con el umbral en uno, 27 de 29. La contra</w:t>
-      </w:r>
-      <w:r>
-        <w:rPr>
-          <w:lang w:val="es-AR"/>
-        </w:rPr>
-        <w:t xml:space="preserve">partida se aceptó de forma explícita: bajar el umbral </w:t>
+        <w:t xml:space="preserve"> Con dos coincidencias exigidas, el clasificador descartaba amenazas evidentes: una campaña de correos fraudulentos que se hacían pasar por una investigación de Interpol contenía un término del diccionario que coincidía sin ambigüedad, y aun así la publicación quedaba clasificada como no relevante porque solo acumulaba una coincidencia. La medición sobre la muestra de control fijó el costo de ambas alternativas: con el umbral en dos se detectaban 25 de 29 amenazas y con el umbral en uno, 27 de 29. La contrapartida se aceptó de forma explícita: bajar el umbral </w:t>
       </w:r>
       <w:r>
         <w:rPr>
@@ -15728,14 +15484,7 @@
           <w:rStyle w:val="VerbatimChar"/>
           <w:lang w:val="es-AR"/>
         </w:rPr>
-        <w:t>caeron</w:t>
-      </w:r>
-      <w:r>
-        <w:rPr>
-          <w:rStyle w:val="VerbatimChar"/>
-          <w:lang w:val="es-AR"/>
-        </w:rPr>
-        <w:t xml:space="preserve"> los servidores</w:t>
+        <w:t>caeron los servidores</w:t>
       </w:r>
       <w:r>
         <w:rPr>
@@ -16162,13 +15911,7 @@
         <w:rPr>
           <w:lang w:val="es-AR"/>
         </w:rPr>
-        <w:t xml:space="preserve"> Se corrigen las erratas —de efecto nulo— y se conserva el resto tal como operó durante la ventana. La razón es metodológica: el marco muestral de la validación —554 publicaciones no clasificadas y censo de las 170 clasificadas— está definido sobre esta versión del clasificador, y retirar términos genéricos lo dejaría sobre otro universo, obligando a rehacer el sorteo y el etiquetado. El efecto de los tres hallazgos restantes se informa cuantificado arriba, se retoma como limitación en 6.3 y como recomendac</w:t>
-      </w:r>
-      <w:r>
-        <w:rPr>
-          <w:lang w:val="es-AR"/>
-        </w:rPr>
-        <w:t xml:space="preserve">ión en el Capítulo 8. La verificación completa, con el detalle de las once publicaciones y la traza de coincidencias de los trece casos, se conserva en </w:t>
+        <w:t xml:space="preserve"> Se corrigen las erratas —de efecto nulo— y se conserva el resto tal como operó durante la ventana. La razón es metodológica: el marco muestral de la validación —554 publicaciones no clasificadas y censo de las 170 clasificadas— está definido sobre esta versión del clasificador, y retirar términos genéricos lo dejaría sobre otro universo, obligando a rehacer el sorteo y el etiquetado. El efecto de los tres hallazgos restantes se informa cuantificado arriba, se retoma como limitación en 6.3 y como recomendación en el Capítulo 8. La verificación completa, con el detalle de las once publicaciones y la traza de coincidencias de los trece casos, se conserva en </w:t>
       </w:r>
       <w:r>
         <w:rPr>
@@ -16785,13 +16528,7 @@
         <w:rPr>
           <w:lang w:val="es-AR"/>
         </w:rPr>
-        <w:t>. Esto tiene una consecuencia directa sobre la evaluación del objetivo específico OE6, que se declara como</w:t>
-      </w:r>
-      <w:r>
-        <w:rPr>
-          <w:lang w:val="es-AR"/>
-        </w:rPr>
-        <w:t xml:space="preserve"> cumplimiento parcial en 5.8 y en la Tabla 7.2.</w:t>
+        <w:t>. Esto tiene una consecuencia directa sobre la evaluación del objetivo específico OE6, que se declara como cumplimiento parcial en 5.8 y en la Tabla 7.2.</w:t>
       </w:r>
     </w:p>
     <w:p>
@@ -16883,13 +16620,7 @@
         <w:rPr>
           <w:lang w:val="es-AR"/>
         </w:rPr>
-        <w:t xml:space="preserve">; es un aviso diario, y así se la </w:t>
-      </w:r>
-      <w:r>
-        <w:rPr>
-          <w:lang w:val="es-AR"/>
-        </w:rPr>
-        <w:t>denomina en el objetivo general y en el título del trabajo. La distinción no es nominal: quien lea «alerta temprana» esperaría una notificación en minutos u horas, y el diseño no la provee. La sección 8.3 (línea de trabajo) condiciona cualquier ampliación del alcance a resolver primero esta latencia.</w:t>
+        <w:t>; es un aviso diario, y así se la denomina en el objetivo general y en el título del trabajo. La distinción no es nominal: quien lea «alerta temprana» esperaría una notificación en minutos u horas, y el diseño no la provee. La sección 8.3 (línea de trabajo) condiciona cualquier ampliación del alcance a resolver primero esta latencia.</w:t>
       </w:r>
     </w:p>
     <w:p>
@@ -17103,13 +16834,7 @@
         <w:rPr>
           <w:lang w:val="es-AR"/>
         </w:rPr>
-        <w:t>Figura 3. Grafo de nodos y conexiones del workflow</w:t>
-      </w:r>
-      <w:r>
-        <w:rPr>
-          <w:lang w:val="es-AR"/>
-        </w:rPr>
-        <w:t xml:space="preserve"> desplegado</w:t>
+        <w:t>Figura 3. Grafo de nodos y conexiones del workflow desplegado</w:t>
       </w:r>
     </w:p>
     <w:p>
@@ -19238,13 +18963,7 @@
         <w:rPr>
           <w:lang w:val="es-AR"/>
         </w:rPr>
-        <w:t>, §5) lo registra como declaración del operador: «Equipo apagado todo el día: no hubo ninguna ejecución del workflow ni ingesta», con la instancia «caída (sin respuesta en su puerto)». El 04/10 la instancia se levantó de nuevo y la recolección se reanudó a las 14:53, con el workflow</w:t>
-      </w:r>
-      <w:r>
-        <w:rPr>
-          <w:lang w:val="es-AR"/>
-        </w:rPr>
-        <w:t xml:space="preserve"> republicado; la bitácora del 04/10 lo consigna como «instancia n8n arriba y workflow publicado (activo)». En otras palabras, la interrupción no fue una caída de un contenedor ni un error del flujo, sino la </w:t>
+        <w:t xml:space="preserve">, §5) lo registra como declaración del operador: «Equipo apagado todo el día: no hubo ninguna ejecución del workflow ni ingesta», con la instancia «caída (sin respuesta en su puerto)». El 04/10 la instancia se levantó de nuevo y la recolección se reanudó a las 14:53, con el workflow republicado; la bitácora del 04/10 lo consigna como «instancia n8n arriba y workflow publicado (activo)». En otras palabras, la interrupción no fue una caída de un contenedor ni un error del flujo, sino la </w:t>
       </w:r>
       <w:r>
         <w:rPr>
@@ -22148,15 +21867,7 @@
           <w:bCs/>
           <w:lang w:val="es-AR"/>
         </w:rPr>
-        <w:t xml:space="preserve">15,0 minutos de mediana y 19,3 en el </w:t>
-      </w:r>
-      <w:r>
-        <w:rPr>
-          <w:b/>
-          <w:bCs/>
-          <w:lang w:val="es-AR"/>
-        </w:rPr>
-        <w:t xml:space="preserve">percentil 95, con el 100 % en estado </w:t>
+        <w:t xml:space="preserve">15,0 minutos de mediana y 19,3 en el percentil 95, con el 100 % en estado </w:t>
       </w:r>
       <w:r>
         <w:rPr>
@@ -22345,13 +22056,7 @@
         <w:rPr>
           <w:lang w:val="es-AR"/>
         </w:rPr>
-        <w:t xml:space="preserve"> Ninguna de las 126 creadas con el motor en ejecución superó los 60 minutos; las 254 pertenecen al grupo creado con el motor detenido, donde representan el 81,7 %. Revisada esa muestra, no aparece un subconjunto con un comportamiento distinto: son publicaciones creadas entre el cierre de una jornada y la apertura de la siguiente. La interrupción de 44 horas del 02/10 al 04/10 queda incluida en el mismo grupo y no se trata como caso aparte, porque su efecto es idéntico en naturaleza —el motor no estaba ejecu</w:t>
-      </w:r>
-      <w:r>
-        <w:rPr>
-          <w:lang w:val="es-AR"/>
-        </w:rPr>
-        <w:t>tándose— y separarla habría sugerido una causa distinta que los datos no muestran.</w:t>
+        <w:t xml:space="preserve"> Ninguna de las 126 creadas con el motor en ejecución superó los 60 minutos; las 254 pertenecen al grupo creado con el motor detenido, donde representan el 81,7 %. Revisada esa muestra, no aparece un subconjunto con un comportamiento distinto: son publicaciones creadas entre el cierre de una jornada y la apertura de la siguiente. La interrupción de 44 horas del 02/10 al 04/10 queda incluida en el mismo grupo y no se trata como caso aparte, porque su efecto es idéntico en naturaleza —el motor no estaba ejecutándose— y separarla habría sugerido una causa distinta que los datos no muestran.</w:t>
       </w:r>
     </w:p>
     <w:p>
@@ -24743,14 +24448,7 @@
           <w:rStyle w:val="VerbatimChar"/>
           <w:lang w:val="es-AR"/>
         </w:rPr>
-        <w:t xml:space="preserve">  "ventana_inicio</w:t>
-      </w:r>
-      <w:r>
-        <w:rPr>
-          <w:rStyle w:val="VerbatimChar"/>
-          <w:lang w:val="es-AR"/>
-        </w:rPr>
-        <w:t>": "2026-10-01T03:00:00+00:00"</w:t>
+        <w:t xml:space="preserve">  "ventana_inicio": "2026-10-01T03:00:00+00:00"</w:t>
       </w:r>
       <w:r>
         <w:rPr>
@@ -27509,13 +27207,7 @@
         <w:rPr>
           <w:lang w:val="es-AR"/>
         </w:rPr>
-        <w:t xml:space="preserve"> y falla en la local, donde 4 de sus 7 detecciones son falsos </w:t>
-      </w:r>
-      <w:r>
-        <w:rPr>
-          <w:lang w:val="es-AR"/>
-        </w:rPr>
-        <w:t xml:space="preserve">positivos —un resultado que confirma, con etiquetado ciego y tres anotadores, la estimación que la V4 había adelantado para esa comunidad—. Segunda: </w:t>
+        <w:t xml:space="preserve"> y falla en la local, donde 4 de sus 7 detecciones son falsos positivos —un resultado que confirma, con etiquetado ciego y tres anotadores, la estimación que la V4 había adelantado para esa comunidad—. Segunda: </w:t>
       </w:r>
       <w:r>
         <w:rPr>
@@ -29445,10 +29137,7 @@
               <w:jc w:val="right"/>
             </w:pPr>
             <w:r>
-              <w:t>−</w:t>
-            </w:r>
-            <w:r>
-              <w:t>2</w:t>
+              <w:t>−2</w:t>
             </w:r>
           </w:p>
         </w:tc>
@@ -29509,10 +29198,7 @@
               <w:jc w:val="right"/>
             </w:pPr>
             <w:r>
-              <w:t>−</w:t>
-            </w:r>
-            <w:r>
-              <w:t>3</w:t>
+              <w:t>−3</w:t>
             </w:r>
           </w:p>
         </w:tc>
@@ -30154,10 +29840,7 @@
               <w:pStyle w:val="Compact"/>
             </w:pPr>
             <w:r>
-              <w:t xml:space="preserve">Falsos </w:t>
-            </w:r>
-            <w:r>
-              <w:t>positivos</w:t>
+              <w:t>Falsos positivos</w:t>
             </w:r>
           </w:p>
         </w:tc>
@@ -32764,10 +32447,7 @@
               <w:t xml:space="preserve">Cadena de RCE preautenticación en PaperCut; el hilo remite a los avisos WT-2026-0141-0144 y a CVE-2026-82077, CVE-2026-82078 y CVE-2026-81578. </w:t>
             </w:r>
             <w:r>
-              <w:t xml:space="preserve">Misma jornada de </w:t>
-            </w:r>
-            <w:r>
-              <w:t>creación e ingesta</w:t>
+              <w:t>Misma jornada de creación e ingesta</w:t>
             </w:r>
           </w:p>
         </w:tc>
@@ -34131,13 +33811,7 @@
         <w:rPr>
           <w:lang w:val="es-AR"/>
         </w:rPr>
-        <w:t>Los casos cuarto</w:t>
-      </w:r>
-      <w:r>
-        <w:rPr>
-          <w:lang w:val="es-AR"/>
-        </w:rPr>
-        <w:t xml:space="preserve"> a séptimo muestran detecciones correctas con puntuaciones bajas (una o dos coincidencias). El caso de </w:t>
+        <w:t xml:space="preserve">Los casos cuarto a séptimo muestran detecciones correctas con puntuaciones bajas (una o dos coincidencias). El caso de </w:t>
       </w:r>
       <w:r>
         <w:rPr>
@@ -34619,10 +34293,7 @@
               <w:t>CUMPLIDO sobre la muestra</w:t>
             </w:r>
             <w:r>
-              <w:t xml:space="preserve"> </w:t>
-            </w:r>
-            <w:r>
-              <w:t>ᵃ</w:t>
+              <w:t xml:space="preserve"> ᵃ</w:t>
             </w:r>
           </w:p>
         </w:tc>
@@ -34683,10 +34354,7 @@
               <w:t>CUMPLIDO</w:t>
             </w:r>
             <w:r>
-              <w:t xml:space="preserve"> </w:t>
-            </w:r>
-            <w:r>
-              <w:t>ᵇ</w:t>
+              <w:t xml:space="preserve"> ᵇ</w:t>
             </w:r>
           </w:p>
         </w:tc>
@@ -35357,13 +35025,7 @@
         <w:rPr>
           <w:lang w:val="es-AR"/>
         </w:rPr>
-        <w:t xml:space="preserve">. El error en la recurrencia de la distribución de Poisson dejaba inalcanzable el umbral de toda categoría con línea base superior a 1,05: el motor estaba funcionando, registraba evaluaciones y no podía detectar nada en las categorías más activas. El segundo defecto, la ausencia de un centinela en el lazo de control, hacía que una comunidad perdiera sistemáticamente sus publicaciones ante un bloqueo de la fuente, sin error visible. Ambos fueron detectados por verificación cruzada entre artefactos (el </w:t>
-      </w:r>
-      <w:r>
-        <w:rPr>
-          <w:lang w:val="es-AR"/>
-        </w:rPr>
-        <w:t xml:space="preserve">workflow evaluado contra el workflow desplegado, y el conteo de la base contra el registro del motor) y no por inspección del código. La lección metodológica es que </w:t>
+        <w:t xml:space="preserve">. El error en la recurrencia de la distribución de Poisson dejaba inalcanzable el umbral de toda categoría con línea base superior a 1,05: el motor estaba funcionando, registraba evaluaciones y no podía detectar nada en las categorías más activas. El segundo defecto, la ausencia de un centinela en el lazo de control, hacía que una comunidad perdiera sistemáticamente sus publicaciones ante un bloqueo de la fuente, sin error visible. Ambos fueron detectados por verificación cruzada entre artefactos (el workflow evaluado contra el workflow desplegado, y el conteo de la base contra el registro del motor) y no por inspección del código. La lección metodológica es que </w:t>
       </w:r>
       <w:r>
         <w:rPr>
@@ -36155,13 +35817,7 @@
         <w:rPr>
           <w:lang w:val="es-AR"/>
         </w:rPr>
-        <w:t xml:space="preserve"> resultó ruidosa en aproximadamente el 83 % de los casos por colisión con la raíz «cert-» en portugués y catalán, y optaron por retirarla. Es exactamente el fenómeno que en este trabajo produjo los falsos positivos de la Tabla 5.12: coincidencia léxica sin desambiguación de contexto, sobre comunidades cuyo vocabulario roza el dominio sin tratar sobre él. Dos trabajos independientes, con plataformas distintas y métodos distintos</w:t>
-      </w:r>
-      <w:r>
-        <w:rPr>
-          <w:lang w:val="es-AR"/>
-        </w:rPr>
-        <w:t>, llegaron al mismo límite del enfoque por términos. Eso convierte la limitación en una propiedad del método y no en una deficiencia particular de esta implementación.</w:t>
+        <w:t xml:space="preserve"> resultó ruidosa en aproximadamente el 83 % de los casos por colisión con la raíz «cert-» en portugués y catalán, y optaron por retirarla. Es exactamente el fenómeno que en este trabajo produjo los falsos positivos de la Tabla 5.12: coincidencia léxica sin desambiguación de contexto, sobre comunidades cuyo vocabulario roza el dominio sin tratar sobre él. Dos trabajos independientes, con plataformas distintas y métodos distintos, llegaron al mismo límite del enfoque por términos. Eso convierte la limitación en una propiedad del método y no en una deficiencia particular de esta implementación.</w:t>
       </w:r>
     </w:p>
     <w:p>
@@ -36300,13 +35956,7 @@
         <w:rPr>
           <w:lang w:val="es-AR"/>
         </w:rPr>
-        <w:t>). La interrupción de 44 horas se declara como</w:t>
-      </w:r>
-      <w:r>
-        <w:rPr>
-          <w:lang w:val="es-AR"/>
-        </w:rPr>
-        <w:t xml:space="preserve"> ausencia de datos.</w:t>
+        <w:t>). La interrupción de 44 horas se declara como ausencia de datos.</w:t>
       </w:r>
     </w:p>
     <w:p>
@@ -36444,13 +36094,7 @@
         <w:rPr>
           <w:lang w:val="es-AR"/>
         </w:rPr>
-        <w:t xml:space="preserve"> Cuatro desacuerdos de categoría en la muestra se atribuyeron a una ambigüedad real entre «Infraestructura y Ataques» y «Malware</w:t>
-      </w:r>
-      <w:r>
-        <w:rPr>
-          <w:lang w:val="es-AR"/>
-        </w:rPr>
-        <w:t>» o «Vulnerabilidades»: el límite entre la herramienta de ataque y la infraestructura sobre la que se ejecuta no tiene una respuesta única.</w:t>
+        <w:t xml:space="preserve"> Cuatro desacuerdos de categoría en la muestra se atribuyeron a una ambigüedad real entre «Infraestructura y Ataques» y «Malware» o «Vulnerabilidades»: el límite entre la herramienta de ataque y la infraestructura sobre la que se ejecuta no tiene una respuesta única.</w:t>
       </w:r>
     </w:p>
     <w:p>
@@ -36524,13 +36168,7 @@
         <w:rPr>
           <w:lang w:val="es-AR"/>
         </w:rPr>
-        <w:t xml:space="preserve"> La muestra se estratificó sobre la clasificación del propio sistema (censo de los 28 casos marcados como amenaza y 22 sorteos del estrato no relevante), y se extrajo de un </w:t>
-      </w:r>
-      <w:r>
-        <w:rPr>
-          <w:lang w:val="es-AR"/>
-        </w:rPr>
-        <w:t>corpus anterior a la ventana B5 que incluía comunidades luego desactivadas. No estima proporciones del corpus de 5.1 y no permite publicar una sensibilidad poblacional; el intervalo del estrato sorteado ([1,1 %; 29,2 %]) es demasiado ancho para sostener una cifra de omisión.</w:t>
+        <w:t xml:space="preserve"> La muestra se estratificó sobre la clasificación del propio sistema (censo de los 28 casos marcados como amenaza y 22 sorteos del estrato no relevante), y se extrajo de un corpus anterior a la ventana B5 que incluía comunidades luego desactivadas. No estima proporciones del corpus de 5.1 y no permite publicar una sensibilidad poblacional; el intervalo del estrato sorteado ([1,1 %; 29,2 %]) es demasiado ancho para sostener una cifra de omisión.</w:t>
       </w:r>
     </w:p>
     <w:p>
@@ -36659,15 +36297,7 @@
           <w:bCs/>
           <w:lang w:val="es-AR"/>
         </w:rPr>
-        <w:t>Latencia incumplida y throughput</w:t>
-      </w:r>
-      <w:r>
-        <w:rPr>
-          <w:b/>
-          <w:bCs/>
-          <w:lang w:val="es-AR"/>
-        </w:rPr>
-        <w:t xml:space="preserve"> no evaluado.</w:t>
+        <w:t>Latencia incumplida y throughput no evaluado.</w:t>
       </w:r>
       <w:r>
         <w:rPr>
@@ -36910,13 +36540,7 @@
         <w:rPr>
           <w:lang w:val="es-AR"/>
         </w:rPr>
-        <w:t xml:space="preserve"> Tres de los hallazgos de este trabajo son transferibles a cualquier pipeline OSINT automatizado: (a) la verificación debe comparar el artefacto desplegado con el artefacto documentado, porque los defectos que más afectan los resultados son silenciosos; (b) la latencia y el throughput</w:t>
-      </w:r>
-      <w:r>
-        <w:rPr>
-          <w:lang w:val="es-AR"/>
-        </w:rPr>
-        <w:t xml:space="preserve"> deben formularse distinguiendo capacidad de artefacto y ritmo de fuente; (c) un etiquetado con un solo anotador no permite afirmar fiabilidad, y declararlo vale más que maquillarlo.</w:t>
+        <w:t xml:space="preserve"> Tres de los hallazgos de este trabajo son transferibles a cualquier pipeline OSINT automatizado: (a) la verificación debe comparar el artefacto desplegado con el artefacto documentado, porque los defectos que más afectan los resultados son silenciosos; (b) la latencia y el throughput deben formularse distinguiendo capacidad de artefacto y ritmo de fuente; (c) un etiquetado con un solo anotador no permite afirmar fiabilidad, y declararlo vale más que maquillarlo.</w:t>
       </w:r>
     </w:p>
     <w:p>
@@ -36938,19 +36562,7 @@
         <w:rPr>
           <w:lang w:val="es-AR"/>
         </w:rPr>
-        <w:t xml:space="preserve"> Las seis líneas de trabajo que se desprenden de estos hallazgos —ampliar la muestra del estrato no relevante con un segundo anotador, incorporar desambiguación por contexto, instrumentar un centinela de latidos, probar la entrega de alertas, registrar la retroalimentación operativa y reformular los criterios temporales— se desarrollan con su criterio de verificación en el Capítulo 8, junto con la línea de trabajo del proyecto. Se enuncian aquí en orden de prioridad: la validez del etiquetado es el primer l</w:t>
-      </w:r>
-      <w:r>
-        <w:rPr>
-          <w:lang w:val="es-AR"/>
-        </w:rPr>
-        <w:t>ímite que conviene cerrar, porque el cálculo realizado indica que un intervalo de ±</w:t>
-      </w:r>
-      <w:r>
-        <w:rPr>
-          <w:lang w:val="es-AR"/>
-        </w:rPr>
-        <w:t xml:space="preserve">5 puntos en el estrato no relevante requiere del orden de </w:t>
+        <w:t xml:space="preserve"> Las seis líneas de trabajo que se desprenden de estos hallazgos —ampliar la muestra del estrato no relevante con un segundo anotador, incorporar desambiguación por contexto, instrumentar un centinela de latidos, probar la entrega de alertas, registrar la retroalimentación operativa y reformular los criterios temporales— se desarrollan con su criterio de verificación en el Capítulo 8, junto con la línea de trabajo del proyecto. Se enuncian aquí en orden de prioridad: la validez del etiquetado es el primer límite que conviene cerrar, porque el cálculo realizado indica que un intervalo de ±5 puntos en el estrato no relevante requiere del orden de </w:t>
       </w:r>
       <w:r>
         <w:rPr>
@@ -38122,14 +37734,77 @@
                 <w:b/>
                 <w:bCs/>
               </w:rPr>
-              <w:t xml:space="preserve">Implementado; </w:t>
-            </w:r>
+              <w:t>Implementado; eficacia no demostrada</w:t>
+            </w:r>
+          </w:p>
+        </w:tc>
+      </w:tr>
+      <w:tr>
+        <w:tc>
+          <w:tcPr>
+            <w:tcW w:w="2640" w:type="dxa"/>
+          </w:tcPr>
+          <w:p>
+            <w:pPr>
+              <w:pStyle w:val="Compact"/>
+              <w:rPr>
+                <w:lang w:val="es-AR"/>
+              </w:rPr>
+            </w:pPr>
+            <w:r>
+              <w:rPr>
+                <w:lang w:val="es-AR"/>
+              </w:rPr>
+              <w:t>OE6. Sistema de alertas con estado operativo explícito</w:t>
+            </w:r>
+          </w:p>
+        </w:tc>
+        <w:tc>
+          <w:tcPr>
+            <w:tcW w:w="2640" w:type="dxa"/>
+          </w:tcPr>
+          <w:p>
+            <w:pPr>
+              <w:pStyle w:val="Compact"/>
+              <w:rPr>
+                <w:lang w:val="es-AR"/>
+              </w:rPr>
+            </w:pPr>
+            <w:r>
+              <w:rPr>
+                <w:lang w:val="es-AR"/>
+              </w:rPr>
+              <w:t xml:space="preserve">6 alertas registradas, todas </w:t>
+            </w:r>
+            <w:r>
+              <w:rPr>
+                <w:rStyle w:val="VerbatimChar"/>
+                <w:lang w:val="es-AR"/>
+              </w:rPr>
+              <w:t>PENDIENTE</w:t>
+            </w:r>
+            <w:r>
+              <w:rPr>
+                <w:lang w:val="es-AR"/>
+              </w:rPr>
+              <w:t>; envío externo deshabilitado</w:t>
+            </w:r>
+          </w:p>
+        </w:tc>
+        <w:tc>
+          <w:tcPr>
+            <w:tcW w:w="2640" w:type="dxa"/>
+          </w:tcPr>
+          <w:p>
+            <w:pPr>
+              <w:pStyle w:val="Compact"/>
+            </w:pPr>
             <w:r>
               <w:rPr>
                 <w:b/>
                 <w:bCs/>
               </w:rPr>
-              <w:t>eficacia no demostrada</w:t>
+              <w:t>Parcial</w:t>
             </w:r>
           </w:p>
         </w:tc>
@@ -38150,7 +37825,7 @@
               <w:rPr>
                 <w:lang w:val="es-AR"/>
               </w:rPr>
-              <w:t>OE6. Sistema de alertas con estado operativo explícito</w:t>
+              <w:t>OE7. Evaluación cuantitativa contra los umbrales declarados en 1.6, con su momento de fijación</w:t>
             </w:r>
           </w:p>
         </w:tc>
@@ -38169,20 +37844,7 @@
               <w:rPr>
                 <w:lang w:val="es-AR"/>
               </w:rPr>
-              <w:t xml:space="preserve">6 alertas registradas, todas </w:t>
-            </w:r>
-            <w:r>
-              <w:rPr>
-                <w:rStyle w:val="VerbatimChar"/>
-                <w:lang w:val="es-AR"/>
-              </w:rPr>
-              <w:t>PENDIENTE</w:t>
-            </w:r>
-            <w:r>
-              <w:rPr>
-                <w:lang w:val="es-AR"/>
-              </w:rPr>
-              <w:t>; envío externo deshabilitado</w:t>
+              <w:t>Tablas 5.4 y 5.8; Tabla 1.1 con la fecha de cada umbral; sin modificaciones posteriores a la V4</w:t>
             </w:r>
           </w:p>
         </w:tc>
@@ -38199,7 +37861,7 @@
                 <w:b/>
                 <w:bCs/>
               </w:rPr>
-              <w:t>Parcial</w:t>
+              <w:t>Cumplido</w:t>
             </w:r>
           </w:p>
         </w:tc>
@@ -38220,7 +37882,7 @@
               <w:rPr>
                 <w:lang w:val="es-AR"/>
               </w:rPr>
-              <w:t>OE7. Evaluación cuantitativa contra los umbrales declarados en 1.6, con su momento de fijación</w:t>
+              <w:t>OE8. Análisis legal y seudonimización conforme a la Ley 25.326</w:t>
             </w:r>
           </w:p>
         </w:tc>
@@ -38239,7 +37901,7 @@
               <w:rPr>
                 <w:lang w:val="es-AR"/>
               </w:rPr>
-              <w:t>Tablas 5.4 y 5.8; Tabla 1.1 con la fecha de cada umbral; sin modificaciones posteriores a la V4</w:t>
+              <w:t>HMAC-SHA-256 con clave por variable de entorno; rotación documentada; riesgo residual declarado (3.4)</w:t>
             </w:r>
           </w:p>
         </w:tc>
@@ -38261,63 +37923,6 @@
           </w:p>
         </w:tc>
       </w:tr>
-      <w:tr>
-        <w:tc>
-          <w:tcPr>
-            <w:tcW w:w="2640" w:type="dxa"/>
-          </w:tcPr>
-          <w:p>
-            <w:pPr>
-              <w:pStyle w:val="Compact"/>
-              <w:rPr>
-                <w:lang w:val="es-AR"/>
-              </w:rPr>
-            </w:pPr>
-            <w:r>
-              <w:rPr>
-                <w:lang w:val="es-AR"/>
-              </w:rPr>
-              <w:t>OE8. Análisis legal y seudonimización conforme a la Ley 25.326</w:t>
-            </w:r>
-          </w:p>
-        </w:tc>
-        <w:tc>
-          <w:tcPr>
-            <w:tcW w:w="2640" w:type="dxa"/>
-          </w:tcPr>
-          <w:p>
-            <w:pPr>
-              <w:pStyle w:val="Compact"/>
-              <w:rPr>
-                <w:lang w:val="es-AR"/>
-              </w:rPr>
-            </w:pPr>
-            <w:r>
-              <w:rPr>
-                <w:lang w:val="es-AR"/>
-              </w:rPr>
-              <w:t>HMAC-SHA-256 con clave por variable de entorno; rotación documentada; riesgo residual declarado (3.4)</w:t>
-            </w:r>
-          </w:p>
-        </w:tc>
-        <w:tc>
-          <w:tcPr>
-            <w:tcW w:w="2640" w:type="dxa"/>
-          </w:tcPr>
-          <w:p>
-            <w:pPr>
-              <w:pStyle w:val="Compact"/>
-            </w:pPr>
-            <w:r>
-              <w:rPr>
-                <w:b/>
-                <w:bCs/>
-              </w:rPr>
-              <w:t>Cumplido</w:t>
-            </w:r>
-          </w:p>
-        </w:tc>
-      </w:tr>
     </w:tbl>
     <w:p>
       <w:pPr>
@@ -38466,13 +38071,7 @@
         <w:rPr>
           <w:lang w:val="es-AR"/>
         </w:rPr>
-        <w:t xml:space="preserve">: 201 términos distribuidos en 9 categorías, con precisión y sensibilidad del 93,1 % sobre la muestra de control, y con una limitación medida y declarada —el 76,47 % de las clasificaciones se sostiene en una única coincidencia léxica—. Este último dato es, paradójicamente, el resultado más útil del capítulo de resultados: indica exactamente dónde está el error </w:t>
-      </w:r>
-      <w:r>
-        <w:rPr>
-          <w:lang w:val="es-AR"/>
-        </w:rPr>
-        <w:t>y cuánto costaría reducirlo. La categoría «Ingeniería Social» no registró coincidencias en la ventana, y ese vacío se informa en lugar de omitirse.</w:t>
+        <w:t>: 201 términos distribuidos en 9 categorías, con precisión y sensibilidad del 93,1 % sobre la muestra de control, y con una limitación medida y declarada —el 76,47 % de las clasificaciones se sostiene en una única coincidencia léxica—. Este último dato es, paradójicamente, el resultado más útil del capítulo de resultados: indica exactamente dónde está el error y cuánto costaría reducirlo. La categoría «Ingeniería Social» no registró coincidencias en la ventana, y ese vacío se informa en lugar de omitirse.</w:t>
       </w:r>
     </w:p>
     <w:p>
@@ -38702,13 +38301,7 @@
         <w:rPr>
           <w:lang w:val="es-AR"/>
         </w:rPr>
-        <w:t xml:space="preserve"> Sí, con un alcance acotado. n8n y PostgreSQL, sobre un único servidor en contenedores, recolectaron 724 publicaciones en 17 jornadas sin licencias ni servicios pagos, aunque con una operación intermitente que cubrió el 19,0 % del período y que se declara como límite </w:t>
-      </w:r>
-      <w:r>
-        <w:rPr>
-          <w:lang w:val="es-AR"/>
-        </w:rPr>
-        <w:t xml:space="preserve">en 5.3 y 6.3. La viabilidad técnica queda demostrada en la dimensión de infraestructura. En la dimensión de rendimiento, la respuesta es matizada: la latencia no se cumplió por causas de operación y el throughput quedó </w:t>
+        <w:t xml:space="preserve"> Sí, con un alcance acotado. n8n y PostgreSQL, sobre un único servidor en contenedores, recolectaron 724 publicaciones en 17 jornadas sin licencias ni servicios pagos, aunque con una operación intermitente que cubrió el 19,0 % del período y que se declara como límite en 5.3 y 6.3. La viabilidad técnica queda demostrada en la dimensión de infraestructura. En la dimensión de rendimiento, la respuesta es matizada: la latencia no se cumplió por causas de operación y el throughput quedó </w:t>
       </w:r>
       <w:r>
         <w:rPr>
@@ -38872,19 +38465,7 @@
         <w:rPr>
           <w:lang w:val="es-AR"/>
         </w:rPr>
-        <w:t xml:space="preserve"> Mediante cuatro medidas implementadas y verificables: (a) seudonimización en el momento de la ingesta con HMAC-SHA-256 y clave por despliegue, de modo que el identificador original nunca se persiste; (b) gestión de la clave fuera del artefacto versionado, con rotación documentada que impide la vinculación de un mismo autor entre períodos; (c) minimización: solo publicaciones públicas, sin comentarios, sin perfiles, sin datos de contacto, y sin perfilado de personas; y (d) declaración explícita del riesgo r</w:t>
-      </w:r>
-      <w:r>
-        <w:rPr>
-          <w:lang w:val="es-AR"/>
-        </w:rPr>
-        <w:t xml:space="preserve">esidual, porque la seudonimización no impide la </w:t>
-      </w:r>
-      <w:r>
-        <w:rPr>
-          <w:lang w:val="es-AR"/>
-        </w:rPr>
-        <w:t xml:space="preserve">reidentificación indirecta a partir del contenido. La respuesta honesta incluye su límite: </w:t>
+        <w:t xml:space="preserve"> Mediante cuatro medidas implementadas y verificables: (a) seudonimización en el momento de la ingesta con HMAC-SHA-256 y clave por despliegue, de modo que el identificador original nunca se persiste; (b) gestión de la clave fuera del artefacto versionado, con rotación documentada que impide la vinculación de un mismo autor entre períodos; (c) minimización: solo publicaciones públicas, sin comentarios, sin perfiles, sin datos de contacto, y sin perfilado de personas; y (d) declaración explícita del riesgo residual, porque la seudonimización no impide la reidentificación indirecta a partir del contenido. La respuesta honesta incluye su límite: </w:t>
       </w:r>
       <w:r>
         <w:rPr>
@@ -38987,13 +38568,7 @@
         <w:rPr>
           <w:lang w:val="es-AR"/>
         </w:rPr>
-        <w:t xml:space="preserve"> La latencia incumplida y el throughput</w:t>
-      </w:r>
-      <w:r>
-        <w:rPr>
-          <w:lang w:val="es-AR"/>
-        </w:rPr>
-        <w:t xml:space="preserve"> no evaluado muestran que los umbrales se formularon sin distinguir lo que el artefacto puede procesar de lo que la fuente produce.</w:t>
+        <w:t xml:space="preserve"> La latencia incumplida y el throughput no evaluado muestran que los umbrales se formularon sin distinguir lo que el artefacto puede procesar de lo que la fuente produce.</w:t>
       </w:r>
     </w:p>
     <w:p>
@@ -39029,19 +38604,7 @@
         <w:rPr>
           <w:lang w:val="es-AR"/>
         </w:rPr>
-        <w:t>El aporte concreto de este trabajo es un artefacto funcional y auditable, un diccionario bilingüe con doscientos un términos verificables</w:t>
-      </w:r>
-      <w:r>
-        <w:rPr>
-          <w:lang w:val="es-AR"/>
-        </w:rPr>
-        <w:t>, un motor de anomalías con umbral estadístico explícito y un cuerpo documental que permite reconstruir cada cifra. Su principal valor metodológico no está en las cifras que alcanza, sino en el conjunto de defectos que detectó, documentó y no ocultó: un lazo de control que perdía publicaciones en silencio, una distribución de probabilidad mal implementada que impedía toda detección en las categorías activas, una carga inicial que el motor reportó como anomalía, una interrupción de servicio de cuarenta y cua</w:t>
-      </w:r>
-      <w:r>
-        <w:rPr>
-          <w:lang w:val="es-AR"/>
-        </w:rPr>
-        <w:t xml:space="preserve">tro horas y una muestra de validación que no permite afirmar fiabilidad. </w:t>
+        <w:t xml:space="preserve">El aporte concreto de este trabajo es un artefacto funcional y auditable, un diccionario bilingüe con doscientos un términos verificables, un motor de anomalías con umbral estadístico explícito y un cuerpo documental que permite reconstruir cada cifra. Su principal valor metodológico no está en las cifras que alcanza, sino en el conjunto de defectos que detectó, documentó y no ocultó: un lazo de control que perdía publicaciones en silencio, una distribución de probabilidad mal implementada que impedía toda detección en las categorías activas, una carga inicial que el motor reportó como anomalía, una interrupción de servicio de cuarenta y cuatro horas y una muestra de validación que no permite afirmar fiabilidad. </w:t>
       </w:r>
       <w:r>
         <w:rPr>
@@ -39852,13 +39415,7 @@
         <w:rPr>
           <w:lang w:val="es-AR"/>
         </w:rPr>
-        <w:t xml:space="preserve"> estable en la consulta), y archivar el conjunto con semilla y hash del archivo de origen, para que la muestra sea </w:t>
-      </w:r>
-      <w:r>
-        <w:rPr>
-          <w:lang w:val="es-AR"/>
-        </w:rPr>
-        <w:t>reconstruible.</w:t>
+        <w:t xml:space="preserve"> estable en la consulta), y archivar el conjunto con semilla y hash del archivo de origen, para que la muestra sea reconstruible.</w:t>
       </w:r>
     </w:p>
     <w:p>
@@ -40102,13 +39659,7 @@
         <w:rPr>
           <w:lang w:val="es-AR"/>
         </w:rPr>
-        <w:t xml:space="preserve">Para organizaciones que evalúen implementar un sistema semejante, la experiencia de este trabajo sugiere cuatro precauciones: no comprometer un criterio de cobertura sin un diseño de captura-recaptura que lo sustente; instrumentar los silencios del pipeline antes que sus resultados; separar en la evaluación el </w:t>
-      </w:r>
-      <w:r>
-        <w:rPr>
-          <w:lang w:val="es-AR"/>
-        </w:rPr>
-        <w:t>desempeño del clasificador de la composición del corpus, porque un buen clasificador sobre un corpus mayoritariamente no relevante produce pocas detecciones y eso no es un defecto; y documentar los límites de acceso de la fuente como parte del producto, ya que determinan qué afirmaciones son sostenibles.</w:t>
+        <w:t>Para organizaciones que evalúen implementar un sistema semejante, la experiencia de este trabajo sugiere cuatro precauciones: no comprometer un criterio de cobertura sin un diseño de captura-recaptura que lo sustente; instrumentar los silencios del pipeline antes que sus resultados; separar en la evaluación el desempeño del clasificador de la composición del corpus, porque un buen clasificador sobre un corpus mayoritariamente no relevante produce pocas detecciones y eso no es un defecto; y documentar los límites de acceso de la fuente como parte del producto, ya que determinan qué afirmaciones son sostenibles.</w:t>
       </w:r>
     </w:p>
     <w:p>
@@ -41607,14 +41158,7 @@
           <w:rStyle w:val="VerbatimChar"/>
           <w:lang w:val="es-AR"/>
         </w:rPr>
-        <w:t xml:space="preserve">    payload</w:t>
-      </w:r>
-      <w:r>
-        <w:rPr>
-          <w:rStyle w:val="VerbatimChar"/>
-          <w:lang w:val="es-AR"/>
-        </w:rPr>
-        <w:t xml:space="preserve">      JSONB,                           -- carga útil del aviso (sin datos personales)</w:t>
+        <w:t xml:space="preserve">    payload      JSONB,                           -- carga útil del aviso (sin datos personales)</w:t>
       </w:r>
       <w:r>
         <w:rPr>
@@ -43768,14 +43312,7 @@
           <w:rStyle w:val="VerbatimChar"/>
           <w:lang w:val="es-AR"/>
         </w:rPr>
-        <w:t xml:space="preserve">// Clasificador por diccionario </w:t>
-      </w:r>
-      <w:r>
-        <w:rPr>
-          <w:rStyle w:val="VerbatimChar"/>
-          <w:lang w:val="es-AR"/>
-        </w:rPr>
-        <w:t>bilingue (ES+EN), 9 categorias. Texto normalizado sin acentos.</w:t>
+        <w:t>// Clasificador por diccionario bilingue (ES+EN), 9 categorias. Texto normalizado sin acentos.</w:t>
       </w:r>
       <w:r>
         <w:rPr>
@@ -43905,14 +43442,7 @@
           <w:rStyle w:val="VerbatimChar"/>
           <w:lang w:val="es-AR"/>
         </w:rPr>
-        <w:t>// sobre "dar de baja apoderado de jubilacion anses", que es tramite</w:t>
-      </w:r>
-      <w:r>
-        <w:rPr>
-          <w:rStyle w:val="VerbatimChar"/>
-          <w:lang w:val="es-AR"/>
-        </w:rPr>
-        <w:t xml:space="preserve"> administrativo y no una</w:t>
+        <w:t>// sobre "dar de baja apoderado de jubilacion anses", que es tramite administrativo y no una</w:t>
       </w:r>
       <w:r>
         <w:rPr>
@@ -44198,14 +43728,7 @@
           <w:rStyle w:val="VerbatimChar"/>
           <w:lang w:val="es-AR"/>
         </w:rPr>
-        <w:t>// fuera del ambito</w:t>
-      </w:r>
-      <w:r>
-        <w:rPr>
-          <w:rStyle w:val="VerbatimChar"/>
-          <w:lang w:val="es-AR"/>
-        </w:rPr>
-        <w:t xml:space="preserve"> del proyecto (amenazas a infraestructura).</w:t>
+        <w:t>// fuera del ambito del proyecto (amenazas a infraestructura).</w:t>
       </w:r>
       <w:r>
         <w:rPr>
@@ -44283,34 +43806,20 @@
           <w:rStyle w:val="VerbatimChar"/>
           <w:lang w:val="es-AR"/>
         </w:rPr>
-        <w:t xml:space="preserve">  'Phishing': ['phishing', 'phisher', 'smishing', 'vishing', 'spear</w:t>
-      </w:r>
-      <w:r>
-        <w:rPr>
-          <w:rStyle w:val="VerbatimChar"/>
-          <w:lang w:val="es-AR"/>
-        </w:rPr>
-        <w:t xml:space="preserve"> phishing', 'correo fraudulento', 'correo suplantado', 'remitente falso', 'enlace fraudulento', 'enlace sospechoso', 'pagina falsa', 'sitio falso', 'portal falso', 'ingreso falso', 'verificar identidad', 'verificacion de identidad', 'captura de datos', 'suplantacion de correo', 'business email compromise', 'fake login', 'credential harvest', 'harvesting'],</w:t>
-      </w:r>
-      <w:r>
-        <w:rPr>
-          <w:lang w:val="es-AR"/>
-        </w:rPr>
-        <w:br/>
-      </w:r>
-      <w:r>
-        <w:rPr>
-          <w:rStyle w:val="VerbatimChar"/>
-          <w:lang w:val="es-AR"/>
-        </w:rPr>
-        <w:t xml:space="preserve">  'Robo de Credenciales': ['clonacion de tarjeta', 'tarjeta clonada', 'clonar', 'robo de contrasena', 'robaron mi contrasena', 'cambio de contrasena</w:t>
-      </w:r>
-      <w:r>
-        <w:rPr>
-          <w:rStyle w:val="VerbatimChar"/>
-          <w:lang w:val="es-AR"/>
-        </w:rPr>
-        <w:t>', 'cambiar mi contrasena', 'acceso no autorizado', 'acceso remoto', 'tomaron control de la cuenta', 'tomo control de mi cuenta', 'sesion robada', 'robo de token', 'segundo factor', 'factor de autenticacion', 'credential stuffing', 'account takeover', 'session hijacking', 'session hijack', 'token theft', 'password theft', 'password dumping', '2fa bypass', 'mfa fatigue', 'sim swap', 'sim swapping', 'otp bypass', 'push bombing', 'adversary in the middle'],</w:t>
+        <w:t xml:space="preserve">  'Phishing': ['phishing', 'phisher', 'smishing', 'vishing', 'spear phishing', 'correo fraudulento', 'correo suplantado', 'remitente falso', 'enlace fraudulento', 'enlace sospechoso', 'pagina falsa', 'sitio falso', 'portal falso', 'ingreso falso', 'verificar identidad', 'verificacion de identidad', 'captura de datos', 'suplantacion de correo', 'business email compromise', 'fake login', 'credential harvest', 'harvesting'],</w:t>
+      </w:r>
+      <w:r>
+        <w:rPr>
+          <w:lang w:val="es-AR"/>
+        </w:rPr>
+        <w:br/>
+      </w:r>
+      <w:r>
+        <w:rPr>
+          <w:rStyle w:val="VerbatimChar"/>
+          <w:lang w:val="es-AR"/>
+        </w:rPr>
+        <w:t xml:space="preserve">  'Robo de Credenciales': ['clonacion de tarjeta', 'tarjeta clonada', 'clonar', 'robo de contrasena', 'robaron mi contrasena', 'cambio de contrasena', 'cambiar mi contrasena', 'acceso no autorizado', 'acceso remoto', 'tomaron control de la cuenta', 'tomo control de mi cuenta', 'sesion robada', 'robo de token', 'segundo factor', 'factor de autenticacion', 'credential stuffing', 'account takeover', 'session hijacking', 'session hijack', 'token theft', 'password theft', 'password dumping', '2fa bypass', 'mfa fatigue', 'sim swap', 'sim swapping', 'otp bypass', 'push bombing', 'adversary in the middle'],</w:t>
       </w:r>
       <w:r>
         <w:rPr>
@@ -44336,54 +43845,33 @@
           <w:rStyle w:val="VerbatimChar"/>
           <w:lang w:val="es-AR"/>
         </w:rPr>
-        <w:t xml:space="preserve">  'Ransomware': ['ransomware', 'nota de rescate', 'pedir rescate', 'piden rescate', 'bloquearon mis archivos', 'mis archivos estan cifrados', 'secuestro de datos', 'extorsion', 'wannacry</w:t>
-      </w:r>
-      <w:r>
-        <w:rPr>
-          <w:rStyle w:val="VerbatimChar"/>
-          <w:lang w:val="es-AR"/>
-        </w:rPr>
-        <w:t>', 'lockbit', 'revil', 'blackcat', 'locker', 'decryptor', 'desencriptador'],</w:t>
-      </w:r>
-      <w:r>
-        <w:rPr>
-          <w:lang w:val="es-AR"/>
-        </w:rPr>
-        <w:br/>
-      </w:r>
-      <w:r>
-        <w:rPr>
-          <w:rStyle w:val="VerbatimChar"/>
-          <w:lang w:val="es-AR"/>
-        </w:rPr>
-        <w:t xml:space="preserve">  'Vulnerabilidades': ['cve', 'exploit', 'exploits', 'parche', 'parchear', 'patch tuesday', 'actualizacion de seguridad', 'backdoor', 'puerta trasera', 'zero day', 'prueba de concepto', 'proof of concept', 'inyeccion sql', 'sql injection', 'xss', 'rce', 'ejecucion remota de codigo', 'escalamiento de privilegios', 'buffer overflow', 'desbordamiento de buffer', 'bypass de autenticacion', 'authentication bypass', 'kerberoasting</w:t>
-      </w:r>
-      <w:r>
-        <w:rPr>
-          <w:rStyle w:val="VerbatimChar"/>
-          <w:lang w:val="es-AR"/>
-        </w:rPr>
-        <w:t>', 'movimiento lateral', 'lateral movement', 'privilege escalation', 'nvd', 'cisa', 'zero day vulnerability', 'poc'],</w:t>
-      </w:r>
-      <w:r>
-        <w:rPr>
-          <w:lang w:val="es-AR"/>
-        </w:rPr>
-        <w:br/>
-      </w:r>
-      <w:r>
-        <w:rPr>
-          <w:rStyle w:val="VerbatimChar"/>
-          <w:lang w:val="es-AR"/>
-        </w:rPr>
-        <w:t xml:space="preserve">  'Filtración de Datos': ['filtracion', 'filtraron', 'filtrado', 'filtran', 'fuga de datos', 'fuga de informacion', 'base filtrada', 'base de datos expuesta', 'bases expuestas', 'base expuesta', 'datos personales', 'venta de datos', 'venden datos', 'vazamiento', 'exfiltracion', 'exfiltrated', 'leak', 'leaked', 'leaks', 'breach', 'breached', 'exposed database', 'exposed credentials', '</w:t>
-      </w:r>
-      <w:r>
-        <w:rPr>
-          <w:rStyle w:val="VerbatimChar"/>
-          <w:lang w:val="es-AR"/>
-        </w:rPr>
-        <w:t>credentials dump', 'combo list', 'dark web', 'pastebin', 'data dump', 'breach notification'],</w:t>
+        <w:t xml:space="preserve">  'Ransomware': ['ransomware', 'nota de rescate', 'pedir rescate', 'piden rescate', 'bloquearon mis archivos', 'mis archivos estan cifrados', 'secuestro de datos', 'extorsion', 'wannacry', 'lockbit', 'revil', 'blackcat', 'locker', 'decryptor', 'desencriptador'],</w:t>
+      </w:r>
+      <w:r>
+        <w:rPr>
+          <w:lang w:val="es-AR"/>
+        </w:rPr>
+        <w:br/>
+      </w:r>
+      <w:r>
+        <w:rPr>
+          <w:rStyle w:val="VerbatimChar"/>
+          <w:lang w:val="es-AR"/>
+        </w:rPr>
+        <w:t xml:space="preserve">  'Vulnerabilidades': ['cve', 'exploit', 'exploits', 'parche', 'parchear', 'patch tuesday', 'actualizacion de seguridad', 'backdoor', 'puerta trasera', 'zero day', 'prueba de concepto', 'proof of concept', 'inyeccion sql', 'sql injection', 'xss', 'rce', 'ejecucion remota de codigo', 'escalamiento de privilegios', 'buffer overflow', 'desbordamiento de buffer', 'bypass de autenticacion', 'authentication bypass', 'kerberoasting', 'movimiento lateral', 'lateral movement', 'privilege escalation', 'nvd', 'cisa', 'zero day vulnerability', 'poc'],</w:t>
+      </w:r>
+      <w:r>
+        <w:rPr>
+          <w:lang w:val="es-AR"/>
+        </w:rPr>
+        <w:br/>
+      </w:r>
+      <w:r>
+        <w:rPr>
+          <w:rStyle w:val="VerbatimChar"/>
+          <w:lang w:val="es-AR"/>
+        </w:rPr>
+        <w:t xml:space="preserve">  'Filtración de Datos': ['filtracion', 'filtraron', 'filtrado', 'filtran', 'fuga de datos', 'fuga de informacion', 'base filtrada', 'base de datos expuesta', 'bases expuestas', 'base expuesta', 'datos personales', 'venta de datos', 'venden datos', 'vazamiento', 'exfiltracion', 'exfiltrated', 'leak', 'leaked', 'leaks', 'breach', 'breached', 'exposed database', 'exposed credentials', 'credentials dump', 'combo list', 'dark web', 'pastebin', 'data dump', 'breach notification'],</w:t>
       </w:r>
       <w:r>
         <w:rPr>
@@ -44409,34 +43897,20 @@
           <w:rStyle w:val="VerbatimChar"/>
           <w:lang w:val="es-AR"/>
         </w:rPr>
-        <w:t xml:space="preserve">  'Hacktivismo': ['hacktivismo', 'hacktivista', 'hackeo', 'hackearon', 'hackear', 'deface', '</w:t>
-      </w:r>
-      <w:r>
-        <w:rPr>
-          <w:rStyle w:val="VerbatimChar"/>
-          <w:lang w:val="es-AR"/>
-        </w:rPr>
-        <w:t>defacement', 'defaced', 'dox', 'doxeado', 'doxing', 'anonymous', 'filtracion publicada', 'publicacion de datos filtrados', 'protesta hacker', 'hactivist'],</w:t>
-      </w:r>
-      <w:r>
-        <w:rPr>
-          <w:lang w:val="es-AR"/>
-        </w:rPr>
-        <w:br/>
-      </w:r>
-      <w:r>
-        <w:rPr>
-          <w:rStyle w:val="VerbatimChar"/>
-          <w:lang w:val="es-AR"/>
-        </w:rPr>
-        <w:t xml:space="preserve">  'Ingenieria Social': ['ingenieria social', 'social engineering', 'mecanismo de engano', 'se hacen pasar', 'suplantar identidad', 'suplantacion de identidad', 'baiting', 'confianza ganada', 'falsa llamada', 'llamada del banco', 'falso empleado', 'falsa policia', 'falso soporte', 'pretexting', 'impersonation', 'pretexto', 'scam call', 'fake support', '</w:t>
-      </w:r>
-      <w:r>
-        <w:rPr>
-          <w:rStyle w:val="VerbatimChar"/>
-          <w:lang w:val="es-AR"/>
-        </w:rPr>
-        <w:t>vishing script', 'ayuda de escritorio falsa']</w:t>
+        <w:t xml:space="preserve">  'Hacktivismo': ['hacktivismo', 'hacktivista', 'hackeo', 'hackearon', 'hackear', 'deface', 'defacement', 'defaced', 'dox', 'doxeado', 'doxing', 'anonymous', 'filtracion publicada', 'publicacion de datos filtrados', 'protesta hacker', 'hactivist'],</w:t>
+      </w:r>
+      <w:r>
+        <w:rPr>
+          <w:lang w:val="es-AR"/>
+        </w:rPr>
+        <w:br/>
+      </w:r>
+      <w:r>
+        <w:rPr>
+          <w:rStyle w:val="VerbatimChar"/>
+          <w:lang w:val="es-AR"/>
+        </w:rPr>
+        <w:t xml:space="preserve">  'Ingenieria Social': ['ingenieria social', 'social engineering', 'mecanismo de engano', 'se hacen pasar', 'suplantar identidad', 'suplantacion de identidad', 'baiting', 'confianza ganada', 'falsa llamada', 'llamada del banco', 'falso empleado', 'falsa policia', 'falso soporte', 'pretexting', 'impersonation', 'pretexto', 'scam call', 'fake support', 'vishing script', 'ayuda de escritorio falsa']</w:t>
       </w:r>
       <w:r>
         <w:rPr>
@@ -44553,14 +44027,7 @@
           <w:rStyle w:val="VerbatimChar"/>
           <w:lang w:val="es-AR"/>
         </w:rPr>
-        <w:t xml:space="preserve">  const words = new Set(</w:t>
-      </w:r>
-      <w:r>
-        <w:rPr>
-          <w:rStyle w:val="VerbatimChar"/>
-          <w:lang w:val="es-AR"/>
-        </w:rPr>
-        <w:t>text.split(/[^a-z0-9]+/));</w:t>
+        <w:t xml:space="preserve">  const words = new Set(text.split(/[^a-z0-9]+/));</w:t>
       </w:r>
       <w:r>
         <w:rPr>
@@ -44768,14 +44235,7 @@
           <w:rStyle w:val="VerbatimChar"/>
           <w:lang w:val="es-AR"/>
         </w:rPr>
-        <w:t xml:space="preserve">    item.json.nlp_score = Math.min(1, Math.round((bestHits</w:t>
-      </w:r>
-      <w:r>
-        <w:rPr>
-          <w:rStyle w:val="VerbatimChar"/>
-          <w:lang w:val="es-AR"/>
-        </w:rPr>
-        <w:t xml:space="preserve"> / SATURATION) * 10000) / 10000); // normalizado [0,1]</w:t>
+        <w:t xml:space="preserve">    item.json.nlp_score = Math.min(1, Math.round((bestHits / SATURATION) * 10000) / 10000); // normalizado [0,1]</w:t>
       </w:r>
       <w:r>
         <w:rPr>
@@ -44944,14 +44404,7 @@
           <w:rStyle w:val="VerbatimChar"/>
           <w:lang w:val="es-AR"/>
         </w:rPr>
-        <w:t xml:space="preserve">const PRODUCTS = ['whatsapp', 'telegram', 'mercado pago', 'windows', 'linux', 'android', 'ios', 'chrome', 'firefox', 'bitcoin', 'usdt', 'afi p', 'banco </w:t>
-      </w:r>
-      <w:r>
-        <w:rPr>
-          <w:rStyle w:val="VerbatimChar"/>
-          <w:lang w:val="es-AR"/>
-        </w:rPr>
-        <w:t>nacion', 'galicia', 'santander', 'uala', 'cvu', 'mercado libre'];</w:t>
+        <w:t>const PRODUCTS = ['whatsapp', 'telegram', 'mercado pago', 'windows', 'linux', 'android', 'ios', 'chrome', 'firefox', 'bitcoin', 'usdt', 'afi p', 'banco nacion', 'galicia', 'santander', 'uala', 'cvu', 'mercado libre'];</w:t>
       </w:r>
       <w:r>
         <w:rPr>
@@ -45068,14 +44521,7 @@
           <w:rStyle w:val="VerbatimChar"/>
           <w:lang w:val="es-AR"/>
         </w:rPr>
-        <w:t xml:space="preserve">    cves: uniq((low.match(/\bcve</w:t>
-      </w:r>
-      <w:r>
-        <w:rPr>
-          <w:rStyle w:val="VerbatimChar"/>
-          <w:lang w:val="es-AR"/>
-        </w:rPr>
-        <w:t>-\d{4}-\d{4,7}\b/g) || []).map((x) =&gt; x.toUpperCase())).slice(0, 20),</w:t>
+        <w:t xml:space="preserve">    cves: uniq((low.match(/\bcve-\d{4}-\d{4,7}\b/g) || []).map((x) =&gt; x.toUpperCase())).slice(0, 20),</w:t>
       </w:r>
       <w:r>
         <w:rPr>
@@ -45166,14 +44612,7 @@
           <w:rStyle w:val="VerbatimChar"/>
           <w:lang w:val="es-AR"/>
         </w:rPr>
-        <w:t xml:space="preserve">  </w:t>
-      </w:r>
-      <w:r>
-        <w:rPr>
-          <w:rStyle w:val="VerbatimChar"/>
-          <w:lang w:val="es-AR"/>
-        </w:rPr>
-        <w:t>item.json.entities_json = JSON.stringify(entities);</w:t>
+        <w:t xml:space="preserve">  item.json.entities_json = JSON.stringify(entities);</w:t>
       </w:r>
       <w:r>
         <w:rPr>
@@ -45312,14 +44751,7 @@
           <w:rStyle w:val="VerbatimChar"/>
           <w:lang w:val="es-AR"/>
         </w:rPr>
-        <w:t>// 2026-10-05: la version anterior aritmetizaba</w:t>
-      </w:r>
-      <w:r>
-        <w:rPr>
-          <w:rStyle w:val="VerbatimChar"/>
-          <w:lang w:val="es-AR"/>
-        </w:rPr>
-        <w:t xml:space="preserve"> las masas con</w:t>
+        <w:t>// 2026-10-05: la version anterior aritmetizaba las masas con</w:t>
       </w:r>
       <w:r>
         <w:rPr>
@@ -45410,14 +44842,7 @@
           <w:rStyle w:val="VerbatimChar"/>
           <w:lang w:val="es-AR"/>
         </w:rPr>
-        <w:t>// Con umbral 501 ninguna categoria</w:t>
-      </w:r>
-      <w:r>
-        <w:rPr>
-          <w:rStyle w:val="VerbatimChar"/>
-          <w:lang w:val="es-AR"/>
-        </w:rPr>
-        <w:t xml:space="preserve"> con base &gt; 1,05 puede disparar nunca: se</w:t>
+        <w:t>// Con umbral 501 ninguna categoria con base &gt; 1,05 puede disparar nunca: se</w:t>
       </w:r>
       <w:r>
         <w:rPr>
@@ -45638,14 +45063,7 @@
           <w:rStyle w:val="VerbatimChar"/>
           <w:lang w:val="es-AR"/>
         </w:rPr>
-        <w:t xml:space="preserve">  </w:t>
-      </w:r>
-      <w:r>
-        <w:rPr>
-          <w:rStyle w:val="VerbatimChar"/>
-          <w:lang w:val="es-AR"/>
-        </w:rPr>
-        <w:t>const lambda = Math.max(0, Number(item.json.base_media) || 0);</w:t>
+        <w:t xml:space="preserve">  const lambda = Math.max(0, Number(item.json.base_media) || 0);</w:t>
       </w:r>
       <w:r>
         <w:rPr>
@@ -45840,14 +45258,7 @@
           <w:rStyle w:val="VerbatimChar"/>
           <w:lang w:val="es-AR"/>
         </w:rPr>
-        <w:t xml:space="preserve">      </w:t>
-      </w:r>
-      <w:r>
-        <w:rPr>
-          <w:rStyle w:val="VerbatimChar"/>
-          <w:lang w:val="es-AR"/>
-        </w:rPr>
-        <w:t>n_observado: n,</w:t>
+        <w:t xml:space="preserve">      n_observado: n,</w:t>
       </w:r>
       <w:r>
         <w:rPr>
@@ -46607,14 +46018,7 @@
           <w:rStyle w:val="VerbatimChar"/>
           <w:lang w:val="es-AR"/>
         </w:rPr>
-        <w:t>-- Inserta TODA la evaluación en anomalias</w:t>
-      </w:r>
-      <w:r>
-        <w:rPr>
-          <w:rStyle w:val="VerbatimChar"/>
-          <w:lang w:val="es-AR"/>
-        </w:rPr>
-        <w:t>; genera alerta solo si hubo disparo.</w:t>
+        <w:t>-- Inserta TODA la evaluación en anomalias; genera alerta solo si hubo disparo.</w:t>
       </w:r>
       <w:r>
         <w:rPr>
@@ -46705,14 +46109,7 @@
           <w:rStyle w:val="VerbatimChar"/>
           <w:lang w:val="es-AR"/>
         </w:rPr>
-        <w:t>-- jsonb_build_array</w:t>
-      </w:r>
-      <w:r>
-        <w:rPr>
-          <w:rStyle w:val="VerbatimChar"/>
-          <w:lang w:val="es-AR"/>
-        </w:rPr>
-        <w:t>: envuelve el objeto en un array de un elemento.</w:t>
+        <w:t>-- jsonb_build_array: envuelve el objeto en un array de un elemento.</w:t>
       </w:r>
       <w:r>
         <w:rPr>
@@ -46907,14 +46304,7 @@
           <w:rStyle w:val="VerbatimChar"/>
           <w:lang w:val="es-AR"/>
         </w:rPr>
-        <w:t xml:space="preserve">  INSERT INTO anomalias (ventana_inicio, ventana_fin, categoria, </w:t>
-      </w:r>
-      <w:r>
-        <w:rPr>
-          <w:rStyle w:val="VerbatimChar"/>
-          <w:lang w:val="es-AR"/>
-        </w:rPr>
-        <w:t>n_observado, base_media, umbral, disparo)</w:t>
+        <w:t xml:space="preserve">  INSERT INTO anomalias (ventana_inicio, ventana_fin, categoria, n_observado, base_media, umbral, disparo)</w:t>
       </w:r>
       <w:r>
         <w:rPr>
@@ -47070,14 +46460,7 @@
           <w:rStyle w:val="VerbatimChar"/>
           <w:lang w:val="es-AR"/>
         </w:rPr>
-        <w:t xml:space="preserve">       jsonb_build_object('categoria', categoria, 'n_observado', </w:t>
-      </w:r>
-      <w:r>
-        <w:rPr>
-          <w:rStyle w:val="VerbatimChar"/>
-          <w:lang w:val="es-AR"/>
-        </w:rPr>
-        <w:t>n_observado, 'base_media', base_media, 'umbral', umbral, 'ventana_inicio', ventana_inicio),</w:t>
+        <w:t xml:space="preserve">       jsonb_build_object('categoria', categoria, 'n_observado', n_observado, 'base_media', base_media, 'umbral', umbral, 'ventana_inicio', ventana_inicio),</w:t>
       </w:r>
       <w:r>
         <w:rPr>
@@ -47173,13 +46556,7 @@
         <w:rPr>
           <w:lang w:val="es-AR"/>
         </w:rPr>
-        <w:t>. Cada consulta fija por medio de literales de fecha el estado congelado del corte, de modo que su salida no cambia</w:t>
-      </w:r>
-      <w:r>
-        <w:rPr>
-          <w:lang w:val="es-AR"/>
-        </w:rPr>
-        <w:t xml:space="preserve"> aunque la base crezca después; la salida literal archivada es la del Anexo D (</w:t>
+        <w:t>. Cada consulta fija por medio de literales de fecha el estado congelado del corte, de modo que su salida no cambia aunque la base crezca después; la salida literal archivada es la del Anexo D (</w:t>
       </w:r>
       <w:r>
         <w:rPr>
@@ -51394,14 +50771,7 @@
                 <w:rStyle w:val="VerbatimChar"/>
                 <w:lang w:val="es-AR"/>
               </w:rPr>
-              <w:t>ingenieria</w:t>
-            </w:r>
-            <w:r>
-              <w:rPr>
-                <w:rStyle w:val="VerbatimChar"/>
-                <w:lang w:val="es-AR"/>
-              </w:rPr>
-              <w:t xml:space="preserve"> social</w:t>
+              <w:t>ingenieria social</w:t>
             </w:r>
             <w:r>
               <w:rPr>
@@ -51941,13 +51311,7 @@
         <w:rPr>
           <w:lang w:val="es-AR"/>
         </w:rPr>
-        <w:t>El comprimido congela el código de los cuatro nodos de código, el SQL de los tres nodos de base de datos, las quince consultas de evidencia (Q1 a Q15), el artefacto del workflow</w:t>
-      </w:r>
-      <w:r>
-        <w:rPr>
-          <w:lang w:val="es-AR"/>
-        </w:rPr>
-        <w:t>, el DDL y la salida literal archivada del Capítulo 5. Su contenido se detalla en el índice del propio archivo (</w:t>
+        <w:t>El comprimido congela el código de los cuatro nodos de código, el SQL de los tres nodos de base de datos, las quince consultas de evidencia (Q1 a Q15), el artefacto del workflow, el DDL y la salida literal archivada del Capítulo 5. Su contenido se detalla en el índice del propio archivo (</w:t>
       </w:r>
       <w:r>
         <w:rPr>
@@ -52409,13 +51773,7 @@
         <w:rPr>
           <w:lang w:val="es-AR"/>
         </w:rPr>
-        <w:t xml:space="preserve"> con fecha 19/10/2026 y corte del corpus en el inicio del 18/10/2026. Las quince consultas fijan por literales de fecha ese estado congelado, de modo que su salida es estable</w:t>
-      </w:r>
-      <w:r>
-        <w:rPr>
-          <w:lang w:val="es-AR"/>
-        </w:rPr>
-        <w:t xml:space="preserve"> aunque la base crezca; esa reproducción se validó una por una contra la salida archivada (</w:t>
+        <w:t xml:space="preserve"> con fecha 19/10/2026 y corte del corpus en el inicio del 18/10/2026. Las quince consultas fijan por literales de fecha ese estado congelado, de modo que su salida es estable aunque la base crezca; esa reproducción se validó una por una contra la salida archivada (</w:t>
       </w:r>
       <w:r>
         <w:rPr>
@@ -52428,13 +51786,7 @@
         <w:rPr>
           <w:lang w:val="es-AR"/>
         </w:rPr>
-        <w:t>). Las métricas del clasificador provienen de la ejecución del nodo de código del artefacto desplegado sobre el texto exacto de las publicaciones de la muestra, y no de una reimplementación del diccionario. Las tres reglas de trabajo que sostienen esa reproducibilidad son: no editar a mano el workflow</w:t>
-      </w:r>
-      <w:r>
-        <w:rPr>
-          <w:lang w:val="es-AR"/>
-        </w:rPr>
-        <w:t xml:space="preserve"> exportado, regenerarlo siempre desde su script, y no modificar la base salvo en operaciones de escritura de la propia ejecución del pipeline.</w:t>
+        <w:t>). Las métricas del clasificador provienen de la ejecución del nodo de código del artefacto desplegado sobre el texto exacto de las publicaciones de la muestra, y no de una reimplementación del diccionario. Las tres reglas de trabajo que sostienen esa reproducibilidad son: no editar a mano el workflow exportado, regenerarlo siempre desde su script, y no modificar la base salvo en operaciones de escritura de la propia ejecución del pipeline.</w:t>
       </w:r>
       <w:bookmarkEnd w:id="68"/>
       <w:bookmarkEnd w:id="75"/>
@@ -54897,6 +54249,18 @@
       <w:sz w:val="22"/>
     </w:rPr>
   </w:style>
+  <w:style w:type="paragraph" w:styleId="NormalWeb">
+    <w:name w:val="Normal (Web)"/>
+    <w:basedOn w:val="Normal"/>
+    <w:rsid w:val="001F5CCD"/>
+    <w:pPr>
+      <w:spacing w:after="0" w:line="200" w:lineRule="auto"/>
+    </w:pPr>
+    <w:rPr>
+      <w:rFonts w:ascii="Consolas" w:hAnsi="Consolas" w:cs="Times New Roman"/>
+      <w:sz w:val="17"/>
+    </w:rPr>
+  </w:style>
 </w:styles>
 </file>
 

</xml_diff>

<commit_message>
Informe V5: compactar portada
</commit_message>
<xml_diff>
--- a/V4/devoluciones/build/tesis_v4.docx
+++ b/V4/devoluciones/build/tesis_v4.docx
@@ -6,6 +6,7 @@
       <w:pPr>
         <w:pStyle w:val="Ttulo1"/>
         <w:suppressAutoHyphens/>
+        <w:spacing w:before="0" w:after="0"/>
         <w:jc w:val="center"/>
         <w:rPr>
           <w:lang w:val="es-AR"/>
@@ -23,6 +24,7 @@
       <w:pPr>
         <w:pStyle w:val="FirstParagraph"/>
         <w:suppressAutoHyphens/>
+        <w:spacing w:before="40" w:after="40"/>
         <w:rPr>
           <w:lang w:val="es-AR"/>
         </w:rPr>
@@ -47,6 +49,7 @@
       <w:pPr>
         <w:pStyle w:val="Textoindependiente"/>
         <w:suppressAutoHyphens/>
+        <w:spacing w:before="40" w:after="40"/>
         <w:rPr>
           <w:lang w:val="es-AR"/>
         </w:rPr>
@@ -62,6 +65,7 @@
       <w:pPr>
         <w:pStyle w:val="Textoindependiente"/>
         <w:suppressAutoHyphens/>
+        <w:spacing w:before="40" w:after="40"/>
         <w:rPr>
           <w:lang w:val="es-AR"/>
         </w:rPr>
@@ -391,6 +395,7 @@
       <w:pPr>
         <w:pStyle w:val="Ttulo2"/>
         <w:suppressAutoHyphens/>
+        <w:spacing w:before="0" w:after="0"/>
         <w:rPr>
           <w:lang w:val="es-AR"/>
         </w:rPr>

</xml_diff>